<commit_message>
1) add OLD stucture without rename; 2) add in 15,5 NICA compenlation sextupoles
</commit_message>
<xml_diff>
--- a/Conference/Вариация критической энергии в применении к ускорительному комплексу NICA.docx
+++ b/Conference/Вариация критической энергии в применении к ускорительному комплексу NICA.docx
@@ -7,47 +7,69 @@
         <w:pStyle w:val="a3"/>
         <w:jc w:val="center"/>
         <w:rPr>
+          <w:rFonts w:ascii="Times New Roman" w:hAnsi="Times New Roman" w:cs="Times New Roman"/>
           <w:sz w:val="40"/>
           <w:szCs w:val="40"/>
         </w:rPr>
       </w:pPr>
       <w:r>
         <w:rPr>
+          <w:rFonts w:ascii="Times New Roman" w:hAnsi="Times New Roman" w:cs="Times New Roman"/>
           <w:sz w:val="40"/>
           <w:szCs w:val="40"/>
         </w:rPr>
         <w:t>Вариация критической энергии в применении к ускорительному комплексу NICA.</w:t>
       </w:r>
     </w:p>
-    <w:p/>
     <w:p>
-      <w:r>
+      <w:pPr>
+        <w:rPr>
+          <w:rFonts w:ascii="Times New Roman" w:hAnsi="Times New Roman" w:cs="Times New Roman"/>
+        </w:rPr>
+      </w:pPr>
+    </w:p>
+    <w:p>
+      <w:pPr>
+        <w:rPr>
+          <w:rFonts w:ascii="Times New Roman" w:hAnsi="Times New Roman" w:cs="Times New Roman"/>
+        </w:rPr>
+      </w:pPr>
+      <w:r>
+        <w:rPr>
+          <w:rFonts w:ascii="Times New Roman" w:hAnsi="Times New Roman" w:cs="Times New Roman"/>
+          <w:b/>
+          <w:bCs/>
+        </w:rPr>
         <w:t>Аннотация</w:t>
       </w:r>
       <w:r>
-        <w:t xml:space="preserve">: </w:t>
-      </w:r>
-      <w:r>
-        <w:t xml:space="preserve">Критическая энергия является важным параметром, определяющим работу ускорителя. Для сохранения устойчивости пучка при прохождении критической энергии используются 2 основных метода: повышение критической энергии и скачкообразное прохождение через критическую энергию. В данной статье рассматривается метод повышения критической энергии в структуре </w:t>
+        <w:rPr>
+          <w:rFonts w:ascii="Times New Roman" w:hAnsi="Times New Roman" w:cs="Times New Roman"/>
+        </w:rPr>
+        <w:t xml:space="preserve">: Критическая энергия является важным параметром, определяющим работу ускорителя. Для сохранения устойчивости пучка при прохождении критической энергии используются 2 основных метода: повышение критической энергии и скачкообразное прохождение через критическую энергию. В данной статье рассматривается метод повышения критической энергии в структуре коллайдера NICA для эксперимента по столкновению поляризованного протонного и </w:t>
       </w:r>
       <w:proofErr w:type="spellStart"/>
       <w:r>
-        <w:t>коллайдера</w:t>
+        <w:rPr>
+          <w:rFonts w:ascii="Times New Roman" w:hAnsi="Times New Roman" w:cs="Times New Roman"/>
+        </w:rPr>
+        <w:t>дейтронного</w:t>
       </w:r>
       <w:proofErr w:type="spellEnd"/>
       <w:r>
-        <w:t xml:space="preserve"> NICA для эксперимента по столкновению поляризованного протонного и </w:t>
-      </w:r>
-      <w:proofErr w:type="spellStart"/>
-      <w:r>
-        <w:t>дейтронного</w:t>
-      </w:r>
-      <w:proofErr w:type="spellEnd"/>
-      <w:r>
+        <w:rPr>
+          <w:rFonts w:ascii="Times New Roman" w:hAnsi="Times New Roman" w:cs="Times New Roman"/>
+        </w:rPr>
         <w:t xml:space="preserve"> пучков.</w:t>
       </w:r>
     </w:p>
-    <w:p/>
+    <w:p>
+      <w:pPr>
+        <w:rPr>
+          <w:rFonts w:ascii="Times New Roman" w:hAnsi="Times New Roman" w:cs="Times New Roman"/>
+        </w:rPr>
+      </w:pPr>
+    </w:p>
     <w:p>
       <w:pPr>
         <w:pStyle w:val="a5"/>
@@ -56,99 +78,244 @@
           <w:numId w:val="1"/>
         </w:numPr>
         <w:rPr>
+          <w:rFonts w:ascii="Times New Roman" w:hAnsi="Times New Roman" w:cs="Times New Roman"/>
+          <w:b/>
+          <w:bCs/>
           <w:lang w:val="en-US"/>
         </w:rPr>
       </w:pPr>
       <w:r>
+        <w:rPr>
+          <w:rFonts w:ascii="Times New Roman" w:hAnsi="Times New Roman" w:cs="Times New Roman"/>
+          <w:b/>
+          <w:bCs/>
+        </w:rPr>
         <w:t>Введение</w:t>
-      </w:r>
-    </w:p>
-    <w:p/>
-    <w:p>
-      <w:pPr>
-        <w:ind w:firstLine="360"/>
-      </w:pPr>
-      <w:r>
-        <w:t xml:space="preserve">Ускорительный комплекс </w:t>
-      </w:r>
-      <w:proofErr w:type="spellStart"/>
-      <w:r>
-        <w:t>коллайдера</w:t>
-      </w:r>
-      <w:proofErr w:type="spellEnd"/>
-      <w:r>
-        <w:t xml:space="preserve"> </w:t>
-      </w:r>
-      <w:r>
-        <w:rPr>
-          <w:lang w:val="en-US"/>
-        </w:rPr>
-        <w:t>NICA</w:t>
-      </w:r>
-      <w:r>
-        <w:t xml:space="preserve"> </w:t>
-      </w:r>
-      <w:r>
-        <w:t xml:space="preserve">изначально проектировался с возможностью реализации </w:t>
-      </w:r>
-      <w:r>
-        <w:t xml:space="preserve">экспериментов по столкновению тяжелых ионов, но также имеется возможность </w:t>
-      </w:r>
-      <w:proofErr w:type="spellStart"/>
-      <w:r>
-        <w:t>эффектовного</w:t>
-      </w:r>
-      <w:proofErr w:type="spellEnd"/>
-      <w:r>
-        <w:t xml:space="preserve"> ускорения протонов и дейтронов для реализации поляризованной программы. </w:t>
       </w:r>
     </w:p>
     <w:p>
       <w:pPr>
         <w:rPr>
-          <w:rFonts w:eastAsiaTheme="minorEastAsia"/>
-          <w:i/>
+          <w:rFonts w:ascii="Times New Roman" w:hAnsi="Times New Roman" w:cs="Times New Roman"/>
+        </w:rPr>
+      </w:pPr>
+    </w:p>
+    <w:p>
+      <w:pPr>
+        <w:ind w:firstLine="360"/>
+        <w:rPr>
+          <w:rFonts w:ascii="Times New Roman" w:hAnsi="Times New Roman" w:cs="Times New Roman"/>
+        </w:rPr>
+      </w:pPr>
+      <w:r>
+        <w:rPr>
+          <w:rFonts w:ascii="Times New Roman" w:hAnsi="Times New Roman" w:cs="Times New Roman"/>
+        </w:rPr>
+        <w:t xml:space="preserve">Ускорительный комплекс коллайдера </w:t>
+      </w:r>
+      <w:r>
+        <w:rPr>
+          <w:rFonts w:ascii="Times New Roman" w:hAnsi="Times New Roman" w:cs="Times New Roman"/>
           <w:lang w:val="en-US"/>
         </w:rPr>
-      </w:pPr>
-      <w:r>
-        <w:tab/>
-      </w:r>
-      <w:r>
-        <w:t xml:space="preserve">Критическая энергия </w:t>
-      </w:r>
-      <w:proofErr w:type="spellStart"/>
-      <w:r>
-        <w:t>коллайдера</w:t>
-      </w:r>
-      <w:proofErr w:type="spellEnd"/>
-      <w:r>
-        <w:t xml:space="preserve"> в эксперименте по </w:t>
-      </w:r>
-      <w:r>
-        <w:t>ускорени</w:t>
-      </w:r>
-      <w:r>
-        <w:t xml:space="preserve">ю </w:t>
-      </w:r>
-      <w:r>
+        <w:t>NICA</w:t>
+      </w:r>
+      <w:r>
+        <w:rPr>
+          <w:rFonts w:ascii="Times New Roman" w:hAnsi="Times New Roman" w:cs="Times New Roman"/>
+        </w:rPr>
+        <w:t xml:space="preserve"> изначально проектировался с возможностью реализации </w:t>
+      </w:r>
+      <w:r>
+        <w:rPr>
+          <w:rFonts w:ascii="Times New Roman" w:hAnsi="Times New Roman" w:cs="Times New Roman"/>
+        </w:rPr>
+        <w:t xml:space="preserve">экспериментов по столкновению тяжелых ионов, </w:t>
+      </w:r>
+      <w:r>
+        <w:rPr>
+          <w:rFonts w:ascii="Times New Roman" w:hAnsi="Times New Roman" w:cs="Times New Roman"/>
+        </w:rPr>
+        <w:t>а</w:t>
+      </w:r>
+      <w:r>
+        <w:rPr>
+          <w:rFonts w:ascii="Times New Roman" w:hAnsi="Times New Roman" w:cs="Times New Roman"/>
+        </w:rPr>
+        <w:t xml:space="preserve"> также</w:t>
+      </w:r>
+      <w:r>
+        <w:rPr>
+          <w:rFonts w:ascii="Times New Roman" w:hAnsi="Times New Roman" w:cs="Times New Roman"/>
+        </w:rPr>
+        <w:t xml:space="preserve"> </w:t>
+      </w:r>
+      <w:r>
+        <w:rPr>
+          <w:rFonts w:ascii="Times New Roman" w:hAnsi="Times New Roman" w:cs="Times New Roman"/>
+        </w:rPr>
+        <w:t>эффек</w:t>
+      </w:r>
+      <w:r>
+        <w:rPr>
+          <w:rFonts w:ascii="Times New Roman" w:hAnsi="Times New Roman" w:cs="Times New Roman"/>
+        </w:rPr>
+        <w:t>ти</w:t>
+      </w:r>
+      <w:r>
+        <w:rPr>
+          <w:rFonts w:ascii="Times New Roman" w:hAnsi="Times New Roman" w:cs="Times New Roman"/>
+        </w:rPr>
+        <w:t>вного ускорения протонов и дейтронов для реализации поляризованной программы.</w:t>
+      </w:r>
+    </w:p>
+    <w:p>
+      <w:pPr>
+        <w:ind w:firstLine="360"/>
+        <w:rPr>
+          <w:rFonts w:ascii="Times New Roman" w:eastAsiaTheme="minorEastAsia" w:hAnsi="Times New Roman" w:cs="Times New Roman"/>
+        </w:rPr>
+      </w:pPr>
+      <w:r>
+        <w:rPr>
+          <w:rFonts w:ascii="Times New Roman" w:hAnsi="Times New Roman" w:cs="Times New Roman"/>
+        </w:rPr>
+        <w:t xml:space="preserve">Для </w:t>
+      </w:r>
+      <w:r>
+        <w:rPr>
+          <w:rFonts w:ascii="Times New Roman" w:hAnsi="Times New Roman" w:cs="Times New Roman"/>
+        </w:rPr>
         <w:t xml:space="preserve">тяжелых ионов золота </w:t>
       </w:r>
-      <w:r>
-        <w:rPr>
-          <w:lang w:val="en-US"/>
-        </w:rPr>
-        <w:t>Au</w:t>
-      </w:r>
-      <w:r>
-        <w:t xml:space="preserve"> равно </w:t>
+      <m:oMath>
+        <m:sPre>
+          <m:sPrePr>
+            <m:ctrlPr>
+              <w:rPr>
+                <w:rFonts w:ascii="Cambria Math" w:hAnsi="Cambria Math" w:cs="Times New Roman"/>
+                <w:i/>
+              </w:rPr>
+            </m:ctrlPr>
+          </m:sPrePr>
+          <m:sub>
+            <m:r>
+              <w:rPr>
+                <w:rFonts w:ascii="Cambria Math" w:hAnsi="Cambria Math" w:cs="Times New Roman"/>
+              </w:rPr>
+              <m:t xml:space="preserve"> </m:t>
+            </m:r>
+          </m:sub>
+          <m:sup>
+            <m:r>
+              <w:rPr>
+                <w:rFonts w:ascii="Cambria Math" w:hAnsi="Cambria Math" w:cs="Times New Roman"/>
+              </w:rPr>
+              <m:t>79</m:t>
+            </m:r>
+          </m:sup>
+          <m:e>
+            <m:r>
+              <w:rPr>
+                <w:rFonts w:ascii="Cambria Math" w:hAnsi="Cambria Math" w:cs="Times New Roman"/>
+              </w:rPr>
+              <m:t>A</m:t>
+            </m:r>
+          </m:e>
+        </m:sPre>
+        <m:sSub>
+          <m:sSubPr>
+            <m:ctrlPr>
+              <w:rPr>
+                <w:rFonts w:ascii="Cambria Math" w:hAnsi="Cambria Math" w:cs="Times New Roman"/>
+                <w:i/>
+              </w:rPr>
+            </m:ctrlPr>
+          </m:sSubPr>
+          <m:e>
+            <m:r>
+              <w:rPr>
+                <w:rFonts w:ascii="Cambria Math" w:hAnsi="Cambria Math" w:cs="Times New Roman"/>
+              </w:rPr>
+              <m:t>u</m:t>
+            </m:r>
+          </m:e>
+          <m:sub>
+            <m:r>
+              <w:rPr>
+                <w:rFonts w:ascii="Cambria Math" w:hAnsi="Cambria Math" w:cs="Times New Roman"/>
+              </w:rPr>
+              <m:t>197</m:t>
+            </m:r>
+          </m:sub>
+        </m:sSub>
+      </m:oMath>
+      <w:r>
+        <w:rPr>
+          <w:rFonts w:ascii="Times New Roman" w:hAnsi="Times New Roman" w:cs="Times New Roman"/>
+        </w:rPr>
+        <w:t xml:space="preserve"> </w:t>
+      </w:r>
+      <w:r>
+        <w:rPr>
+          <w:rFonts w:ascii="Times New Roman" w:hAnsi="Times New Roman" w:cs="Times New Roman"/>
+        </w:rPr>
+        <w:t>c</w:t>
+      </w:r>
+      <w:r>
+        <w:rPr>
+          <w:rFonts w:ascii="Times New Roman" w:hAnsi="Times New Roman" w:cs="Times New Roman"/>
+        </w:rPr>
+        <w:t xml:space="preserve"> максимальной энергией 4.5 ГэВ</w:t>
+      </w:r>
+      <w:r>
+        <w:rPr>
+          <w:rFonts w:ascii="Times New Roman" w:hAnsi="Times New Roman" w:cs="Times New Roman"/>
+        </w:rPr>
+        <w:t>/</w:t>
+      </w:r>
+      <w:r>
+        <w:rPr>
+          <w:rFonts w:ascii="Times New Roman" w:hAnsi="Times New Roman" w:cs="Times New Roman"/>
+        </w:rPr>
+        <w:t>н</w:t>
+      </w:r>
+      <w:r>
+        <w:rPr>
+          <w:rFonts w:ascii="Times New Roman" w:hAnsi="Times New Roman" w:cs="Times New Roman"/>
+        </w:rPr>
+        <w:t>уклон к</w:t>
+      </w:r>
+      <w:r>
+        <w:rPr>
+          <w:rFonts w:ascii="Times New Roman" w:hAnsi="Times New Roman" w:cs="Times New Roman"/>
+        </w:rPr>
+        <w:t xml:space="preserve">ритическая энергия коллайдера </w:t>
+      </w:r>
+      <w:r>
+        <w:rPr>
+          <w:rFonts w:ascii="Times New Roman" w:hAnsi="Times New Roman" w:cs="Times New Roman"/>
+        </w:rPr>
+        <w:t>равн</w:t>
+      </w:r>
+      <w:r>
+        <w:rPr>
+          <w:rFonts w:ascii="Times New Roman" w:hAnsi="Times New Roman" w:cs="Times New Roman"/>
+        </w:rPr>
+        <w:t>а</w:t>
+      </w:r>
+      <w:r>
+        <w:rPr>
+          <w:rFonts w:ascii="Times New Roman" w:hAnsi="Times New Roman" w:cs="Times New Roman"/>
+        </w:rPr>
+        <w:t xml:space="preserve"> </w:t>
       </w:r>
       <m:oMath>
         <m:sSubSup>
           <m:sSubSupPr>
             <m:ctrlPr>
               <w:rPr>
-                <w:rFonts w:ascii="Cambria Math" w:hAnsi="Cambria Math"/>
+                <w:rFonts w:ascii="Cambria Math" w:hAnsi="Cambria Math" w:cs="Times New Roman"/>
                 <w:i/>
               </w:rPr>
             </m:ctrlPr>
@@ -159,20 +326,21 @@
                 <m:sty m:val="p"/>
               </m:rPr>
               <w:rPr>
-                <w:rFonts w:ascii="Cambria Math" w:hAnsi="Cambria Math"/>
-              </w:rPr>
-              <m:t>γ</m:t>
-            </m:r>
-            <m:ctrlPr>
-              <w:rPr>
-                <w:rFonts w:ascii="Cambria Math" w:hAnsi="Cambria Math"/>
+                <w:rFonts w:ascii="Cambria Math" w:hAnsi="Cambria Math" w:cs="Times New Roman"/>
+              </w:rPr>
+              <m:t>E</m:t>
+            </m:r>
+            <m:ctrlPr>
+              <w:rPr>
+                <w:rFonts w:ascii="Cambria Math" w:hAnsi="Cambria Math" w:cs="Times New Roman"/>
               </w:rPr>
             </m:ctrlPr>
           </m:e>
           <m:sub>
             <m:r>
               <w:rPr>
-                <w:rFonts w:ascii="Cambria Math" w:hAnsi="Cambria Math"/>
+                <w:rFonts w:ascii="Cambria Math" w:hAnsi="Cambria Math" w:cs="Times New Roman"/>
+                <w:lang w:val="en-US"/>
               </w:rPr>
               <m:t>tr</m:t>
             </m:r>
@@ -180,43 +348,1103 @@
           <m:sup>
             <m:r>
               <w:rPr>
-                <w:rFonts w:ascii="Cambria Math" w:hAnsi="Cambria Math"/>
-              </w:rPr>
-              <m:t>Au-Au</m:t>
+                <w:rFonts w:ascii="Cambria Math" w:hAnsi="Cambria Math" w:cs="Times New Roman"/>
+              </w:rPr>
+              <m:t>Au</m:t>
+            </m:r>
+            <m:r>
+              <w:rPr>
+                <w:rFonts w:ascii="Cambria Math" w:hAnsi="Cambria Math" w:cs="Times New Roman"/>
+              </w:rPr>
+              <m:t>-</m:t>
+            </m:r>
+            <m:r>
+              <w:rPr>
+                <w:rFonts w:ascii="Cambria Math" w:hAnsi="Cambria Math" w:cs="Times New Roman"/>
+              </w:rPr>
+              <m:t>Au</m:t>
             </m:r>
           </m:sup>
         </m:sSubSup>
         <m:r>
           <w:rPr>
+            <w:rFonts w:ascii="Cambria Math" w:hAnsi="Cambria Math" w:cs="Times New Roman"/>
+          </w:rPr>
+          <m:t>=</m:t>
+        </m:r>
+        <m:r>
+          <w:rPr>
+            <w:rFonts w:ascii="Cambria Math" w:hAnsi="Cambria Math" w:cs="Times New Roman"/>
+          </w:rPr>
+          <m:t>5,</m:t>
+        </m:r>
+        <m:r>
+          <w:rPr>
+            <w:rFonts w:ascii="Cambria Math" w:hAnsi="Cambria Math" w:cs="Times New Roman"/>
+          </w:rPr>
+          <m:t>7</m:t>
+        </m:r>
+        <m:r>
+          <w:rPr>
+            <w:rFonts w:ascii="Cambria Math" w:hAnsi="Cambria Math" w:cs="Times New Roman"/>
+          </w:rPr>
+          <m:t xml:space="preserve"> </m:t>
+        </m:r>
+        <m:r>
+          <w:rPr>
+            <w:rFonts w:ascii="Cambria Math" w:eastAsiaTheme="minorEastAsia" w:hAnsi="Cambria Math" w:cs="Times New Roman"/>
+          </w:rPr>
+          <m:t>ГэВ</m:t>
+        </m:r>
+      </m:oMath>
+      <w:r>
+        <w:rPr>
+          <w:rFonts w:ascii="Times New Roman" w:eastAsiaTheme="minorEastAsia" w:hAnsi="Times New Roman" w:cs="Times New Roman"/>
+        </w:rPr>
+        <w:t xml:space="preserve"> </w:t>
+      </w:r>
+      <w:r>
+        <w:rPr>
+          <w:rFonts w:ascii="Times New Roman" w:hAnsi="Times New Roman" w:cs="Times New Roman"/>
+        </w:rPr>
+        <w:t>(</w:t>
+      </w:r>
+      <w:r>
+        <w:rPr>
+          <w:rFonts w:ascii="Times New Roman" w:hAnsi="Times New Roman" w:cs="Times New Roman"/>
+        </w:rPr>
+        <w:t xml:space="preserve"> </w:t>
+      </w:r>
+      <m:oMath>
+        <m:sSubSup>
+          <m:sSubSupPr>
+            <m:ctrlPr>
+              <w:rPr>
+                <w:rFonts w:ascii="Cambria Math" w:hAnsi="Cambria Math" w:cs="Times New Roman"/>
+                <w:i/>
+              </w:rPr>
+            </m:ctrlPr>
+          </m:sSubSupPr>
+          <m:e>
+            <m:r>
+              <m:rPr>
+                <m:sty m:val="p"/>
+              </m:rPr>
+              <w:rPr>
+                <w:rFonts w:ascii="Cambria Math" w:hAnsi="Cambria Math" w:cs="Times New Roman"/>
+              </w:rPr>
+              <m:t>γ</m:t>
+            </m:r>
+            <m:ctrlPr>
+              <w:rPr>
+                <w:rFonts w:ascii="Cambria Math" w:hAnsi="Cambria Math" w:cs="Times New Roman"/>
+              </w:rPr>
+            </m:ctrlPr>
+          </m:e>
+          <m:sub>
+            <m:r>
+              <w:rPr>
+                <w:rFonts w:ascii="Cambria Math" w:hAnsi="Cambria Math" w:cs="Times New Roman"/>
+              </w:rPr>
+              <m:t>tr</m:t>
+            </m:r>
+          </m:sub>
+          <m:sup>
+            <m:r>
+              <w:rPr>
+                <w:rFonts w:ascii="Cambria Math" w:hAnsi="Cambria Math" w:cs="Times New Roman"/>
+              </w:rPr>
+              <m:t>Au</m:t>
+            </m:r>
+            <m:r>
+              <w:rPr>
+                <w:rFonts w:ascii="Cambria Math" w:hAnsi="Cambria Math" w:cs="Times New Roman"/>
+              </w:rPr>
+              <m:t>-</m:t>
+            </m:r>
+            <m:r>
+              <w:rPr>
+                <w:rFonts w:ascii="Cambria Math" w:hAnsi="Cambria Math" w:cs="Times New Roman"/>
+              </w:rPr>
+              <m:t>Au</m:t>
+            </m:r>
+          </m:sup>
+        </m:sSubSup>
+        <m:r>
+          <w:rPr>
+            <w:rFonts w:ascii="Cambria Math" w:hAnsi="Cambria Math" w:cs="Times New Roman"/>
+          </w:rPr>
+          <m:t>=</m:t>
+        </m:r>
+        <m:r>
+          <w:rPr>
+            <w:rFonts w:ascii="Cambria Math" w:hAnsi="Cambria Math" w:cs="Times New Roman"/>
+          </w:rPr>
+          <m:t>7</m:t>
+        </m:r>
+        <m:r>
+          <w:rPr>
+            <w:rFonts w:ascii="Cambria Math" w:hAnsi="Cambria Math" w:cs="Times New Roman"/>
+          </w:rPr>
+          <m:t>,1</m:t>
+        </m:r>
+        <m:r>
+          <w:rPr>
+            <w:rFonts w:ascii="Cambria Math" w:hAnsi="Cambria Math" w:cs="Times New Roman"/>
+          </w:rPr>
+          <m:t xml:space="preserve"> </m:t>
+        </m:r>
+        <m:r>
+          <w:rPr>
+            <w:rFonts w:ascii="Cambria Math" w:eastAsiaTheme="minorEastAsia" w:hAnsi="Cambria Math" w:cs="Times New Roman"/>
+          </w:rPr>
+          <m:t>)</m:t>
+        </m:r>
+        <m:r>
+          <w:rPr>
+            <w:rFonts w:ascii="Cambria Math" w:eastAsiaTheme="minorEastAsia" w:hAnsi="Cambria Math" w:cs="Times New Roman"/>
+          </w:rPr>
+          <m:t>.</m:t>
+        </m:r>
+      </m:oMath>
+      <w:r>
+        <w:rPr>
+          <w:rFonts w:ascii="Times New Roman" w:eastAsiaTheme="minorEastAsia" w:hAnsi="Times New Roman" w:cs="Times New Roman"/>
+        </w:rPr>
+        <w:t xml:space="preserve"> </w:t>
+      </w:r>
+      <w:r>
+        <w:rPr>
+          <w:rFonts w:ascii="Times New Roman" w:eastAsiaTheme="minorEastAsia" w:hAnsi="Times New Roman" w:cs="Times New Roman"/>
+        </w:rPr>
+        <w:t xml:space="preserve">Таким образом, проблем с прохождением критической энергии не возникает, что было изначально учтено при проектировании </w:t>
+      </w:r>
+      <w:proofErr w:type="spellStart"/>
+      <w:r>
+        <w:rPr>
+          <w:rFonts w:ascii="Times New Roman" w:eastAsiaTheme="minorEastAsia" w:hAnsi="Times New Roman" w:cs="Times New Roman"/>
+        </w:rPr>
+        <w:t>магнито</w:t>
+      </w:r>
+      <w:proofErr w:type="spellEnd"/>
+      <w:r>
+        <w:rPr>
+          <w:rFonts w:ascii="Times New Roman" w:eastAsiaTheme="minorEastAsia" w:hAnsi="Times New Roman" w:cs="Times New Roman"/>
+        </w:rPr>
+        <w:t>-оптической структуры.</w:t>
+      </w:r>
+      <w:r>
+        <w:rPr>
+          <w:rFonts w:ascii="Times New Roman" w:eastAsiaTheme="minorEastAsia" w:hAnsi="Times New Roman" w:cs="Times New Roman"/>
+        </w:rPr>
+        <w:t xml:space="preserve"> Такое значение критической энергии было достигнуто выбором частоты </w:t>
+      </w:r>
+      <w:r>
+        <w:rPr>
+          <w:rFonts w:ascii="Times New Roman" w:hAnsi="Times New Roman" w:cs="Times New Roman"/>
+        </w:rPr>
+        <w:t xml:space="preserve">бетатронных колебаний в горизонтальной плоскости </w:t>
+      </w:r>
+      <m:oMath>
+        <m:sSub>
+          <m:sSubPr>
+            <m:ctrlPr>
+              <w:rPr>
+                <w:rFonts w:ascii="Cambria Math" w:hAnsi="Cambria Math"/>
+              </w:rPr>
+            </m:ctrlPr>
+          </m:sSubPr>
+          <m:e>
+            <m:r>
+              <w:rPr>
+                <w:rFonts w:ascii="Cambria Math" w:hAnsi="Cambria Math"/>
+              </w:rPr>
+              <m:t>ν</m:t>
+            </m:r>
+          </m:e>
+          <m:sub>
+            <m:r>
+              <w:rPr>
+                <w:rFonts w:ascii="Cambria Math" w:hAnsi="Cambria Math"/>
+              </w:rPr>
+              <m:t>x</m:t>
+            </m:r>
+          </m:sub>
+        </m:sSub>
+      </m:oMath>
+      <w:r>
+        <w:rPr>
+          <w:rFonts w:ascii="Times New Roman" w:hAnsi="Times New Roman" w:cs="Times New Roman"/>
+        </w:rPr>
+        <w:t>,</w:t>
+      </w:r>
+      <w:r>
+        <w:rPr>
+          <w:rFonts w:ascii="Times New Roman" w:hAnsi="Times New Roman" w:cs="Times New Roman"/>
+        </w:rPr>
+        <w:t xml:space="preserve"> </w:t>
+      </w:r>
+      <w:r>
+        <w:rPr>
+          <w:rFonts w:ascii="Times New Roman" w:hAnsi="Times New Roman" w:cs="Times New Roman"/>
+        </w:rPr>
+        <w:t xml:space="preserve">которая  при условии регулярности структуры арок, состоящих из одинаковых ячеек ФОДО,  должна быть больше максимального значения фактора Лоренца во всем интервале энергии </w:t>
+      </w:r>
+      <m:oMath>
+        <m:r>
+          <m:rPr>
+            <m:sty m:val="p"/>
+          </m:rPr>
+          <w:rPr>
             <w:rFonts w:ascii="Cambria Math" w:hAnsi="Cambria Math"/>
           </w:rPr>
-          <m:t>=</m:t>
+          <m:t xml:space="preserve"> </m:t>
+        </m:r>
+        <m:sSub>
+          <m:sSubPr>
+            <m:ctrlPr>
+              <w:rPr>
+                <w:rFonts w:ascii="Cambria Math" w:hAnsi="Cambria Math"/>
+              </w:rPr>
+            </m:ctrlPr>
+          </m:sSubPr>
+          <m:e>
+            <m:r>
+              <w:rPr>
+                <w:rFonts w:ascii="Cambria Math" w:hAnsi="Cambria Math"/>
+              </w:rPr>
+              <m:t>ν</m:t>
+            </m:r>
+          </m:e>
+          <m:sub>
+            <m:r>
+              <w:rPr>
+                <w:rFonts w:ascii="Cambria Math" w:hAnsi="Cambria Math"/>
+              </w:rPr>
+              <m:t>x</m:t>
+            </m:r>
+          </m:sub>
+        </m:sSub>
+        <m:r>
+          <m:rPr>
+            <m:sty m:val="p"/>
+          </m:rPr>
+          <w:rPr>
+            <w:rFonts w:ascii="Cambria Math" w:hAnsi="Cambria Math"/>
+          </w:rPr>
+          <m:t>≈</m:t>
+        </m:r>
+        <m:sSubSup>
+          <m:sSubSupPr>
+            <m:ctrlPr>
+              <w:rPr>
+                <w:rFonts w:ascii="Cambria Math" w:hAnsi="Cambria Math"/>
+              </w:rPr>
+            </m:ctrlPr>
+          </m:sSubSupPr>
+          <m:e>
+            <m:r>
+              <w:rPr>
+                <w:rFonts w:ascii="Cambria Math" w:hAnsi="Cambria Math"/>
+              </w:rPr>
+              <m:t>γ</m:t>
+            </m:r>
+          </m:e>
+          <m:sub>
+            <m:r>
+              <m:rPr>
+                <m:sty m:val="p"/>
+              </m:rPr>
+              <w:rPr>
+                <w:rFonts w:ascii="Cambria Math" w:hAnsi="Cambria Math"/>
+              </w:rPr>
+              <m:t>tr</m:t>
+            </m:r>
+          </m:sub>
+          <m:sup>
+            <m:r>
+              <w:rPr>
+                <w:rFonts w:ascii="Cambria Math" w:hAnsi="Cambria Math"/>
+              </w:rPr>
+              <m:t>Au</m:t>
+            </m:r>
+          </m:sup>
+        </m:sSubSup>
+        <m:r>
+          <m:rPr>
+            <m:sty m:val="p"/>
+          </m:rPr>
+          <w:rPr>
+            <w:rFonts w:ascii="Cambria Math" w:hAnsi="Cambria Math"/>
+          </w:rPr>
+          <m:t>&gt;</m:t>
+        </m:r>
+        <m:sSubSup>
+          <m:sSubSupPr>
+            <m:ctrlPr>
+              <w:rPr>
+                <w:rFonts w:ascii="Cambria Math" w:hAnsi="Cambria Math"/>
+              </w:rPr>
+            </m:ctrlPr>
+          </m:sSubSupPr>
+          <m:e>
+            <m:r>
+              <w:rPr>
+                <w:rFonts w:ascii="Cambria Math" w:hAnsi="Cambria Math"/>
+              </w:rPr>
+              <m:t>γ</m:t>
+            </m:r>
+          </m:e>
+          <m:sub>
+            <m:r>
+              <w:rPr>
+                <w:rFonts w:ascii="Cambria Math" w:hAnsi="Cambria Math"/>
+              </w:rPr>
+              <m:t>max</m:t>
+            </m:r>
+          </m:sub>
+          <m:sup>
+            <m:r>
+              <w:rPr>
+                <w:rFonts w:ascii="Cambria Math" w:hAnsi="Cambria Math"/>
+              </w:rPr>
+              <m:t>Au</m:t>
+            </m:r>
+          </m:sup>
+        </m:sSubSup>
+        <m:r>
+          <m:rPr>
+            <m:sty m:val="p"/>
+          </m:rPr>
+          <w:rPr>
+            <w:rFonts w:ascii="Cambria Math" w:hAnsi="Cambria Math"/>
+          </w:rPr>
+          <m:t>≈</m:t>
+        </m:r>
+        <m:r>
+          <m:rPr>
+            <m:sty m:val="p"/>
+          </m:rPr>
+          <w:rPr>
+            <w:rFonts w:ascii="Cambria Math" w:hAnsi="Cambria Math"/>
+          </w:rPr>
+          <m:t>5.8</m:t>
         </m:r>
       </m:oMath>
+      <w:r>
+        <w:rPr>
+          <w:rFonts w:ascii="Times New Roman" w:hAnsi="Times New Roman" w:cs="Times New Roman"/>
+        </w:rPr>
+        <w:t>.</w:t>
+      </w:r>
+      <w:r>
+        <w:rPr>
+          <w:rFonts w:ascii="Times New Roman" w:hAnsi="Times New Roman" w:cs="Times New Roman"/>
+        </w:rPr>
+        <w:t xml:space="preserve"> В данном случае была выбрана частота</w:t>
+      </w:r>
+      <w:r>
+        <w:rPr>
+          <w:rFonts w:ascii="Times New Roman" w:hAnsi="Times New Roman" w:cs="Times New Roman"/>
+        </w:rPr>
+        <w:t xml:space="preserve"> </w:t>
+      </w:r>
+      <m:oMath>
+        <m:sSubSup>
+          <m:sSubSupPr>
+            <m:ctrlPr>
+              <w:rPr>
+                <w:rFonts w:ascii="Cambria Math" w:hAnsi="Cambria Math"/>
+                <w:i/>
+                <w:lang w:val="en-US"/>
+              </w:rPr>
+            </m:ctrlPr>
+          </m:sSubSupPr>
+          <m:e>
+            <m:r>
+              <w:rPr>
+                <w:rFonts w:ascii="Cambria Math" w:hAnsi="Cambria Math"/>
+              </w:rPr>
+              <m:t>ν</m:t>
+            </m:r>
+            <m:ctrlPr>
+              <w:rPr>
+                <w:rFonts w:ascii="Cambria Math" w:hAnsi="Cambria Math"/>
+                <w:i/>
+              </w:rPr>
+            </m:ctrlPr>
+          </m:e>
+          <m:sub>
+            <m:r>
+              <w:rPr>
+                <w:rFonts w:ascii="Cambria Math" w:hAnsi="Cambria Math"/>
+              </w:rPr>
+              <m:t>x</m:t>
+            </m:r>
+            <m:r>
+              <w:rPr>
+                <w:rFonts w:ascii="Cambria Math" w:hAnsi="Cambria Math"/>
+              </w:rPr>
+              <m:t>,y</m:t>
+            </m:r>
+            <m:ctrlPr>
+              <w:rPr>
+                <w:rFonts w:ascii="Cambria Math" w:hAnsi="Cambria Math"/>
+                <w:i/>
+              </w:rPr>
+            </m:ctrlPr>
+          </m:sub>
+          <m:sup>
+            <m:r>
+              <w:rPr>
+                <w:rFonts w:ascii="Cambria Math" w:hAnsi="Cambria Math"/>
+                <w:lang w:val="en-US"/>
+              </w:rPr>
+              <m:t>Au</m:t>
+            </m:r>
+          </m:sup>
+        </m:sSubSup>
+        <m:r>
+          <w:rPr>
+            <w:rFonts w:ascii="Cambria Math" w:hAnsi="Cambria Math"/>
+          </w:rPr>
+          <m:t>= 9,4</m:t>
+        </m:r>
+        <m:r>
+          <w:rPr>
+            <w:rFonts w:ascii="Cambria Math" w:hAnsi="Cambria Math"/>
+          </w:rPr>
+          <m:t>4</m:t>
+        </m:r>
+      </m:oMath>
+      <w:r>
+        <w:rPr>
+          <w:rFonts w:ascii="Times New Roman" w:eastAsiaTheme="minorEastAsia" w:hAnsi="Times New Roman" w:cs="Times New Roman"/>
+        </w:rPr>
+        <w:t>.</w:t>
+      </w:r>
     </w:p>
     <w:p>
       <w:pPr>
-        <w:rPr>
-          <w:rFonts w:eastAsiaTheme="minorEastAsia"/>
-        </w:rPr>
-      </w:pPr>
+        <w:ind w:firstLine="360"/>
+        <w:rPr>
+          <w:rFonts w:ascii="Times New Roman" w:eastAsiaTheme="minorEastAsia" w:hAnsi="Times New Roman" w:cs="Times New Roman"/>
+          <w:i/>
+        </w:rPr>
+      </w:pPr>
+      <w:r>
+        <w:rPr>
+          <w:rFonts w:ascii="Times New Roman" w:eastAsiaTheme="minorEastAsia" w:hAnsi="Times New Roman" w:cs="Times New Roman"/>
+        </w:rPr>
+        <w:t xml:space="preserve">При ускорении протонов магнитная жесткость в поворотных арках остаётся неизменной </w:t>
+      </w:r>
+      <m:oMath>
+        <m:sSub>
+          <m:sSubPr>
+            <m:ctrlPr>
+              <w:rPr>
+                <w:rFonts w:ascii="Cambria Math" w:hAnsi="Cambria Math"/>
+              </w:rPr>
+            </m:ctrlPr>
+          </m:sSubPr>
+          <m:e>
+            <m:r>
+              <w:rPr>
+                <w:rFonts w:ascii="Cambria Math" w:hAnsi="Cambria Math"/>
+              </w:rPr>
+              <m:t>R</m:t>
+            </m:r>
+          </m:e>
+          <m:sub>
+            <m:r>
+              <w:rPr>
+                <w:rFonts w:ascii="Cambria Math" w:hAnsi="Cambria Math"/>
+              </w:rPr>
+              <m:t>arc</m:t>
+            </m:r>
+          </m:sub>
+        </m:sSub>
+        <m:r>
+          <m:rPr>
+            <m:sty m:val="p"/>
+          </m:rPr>
+          <w:rPr>
+            <w:rFonts w:ascii="Cambria Math" w:hAnsi="Cambria Math"/>
+          </w:rPr>
+          <m:t>⋅</m:t>
+        </m:r>
+        <m:sSub>
+          <m:sSubPr>
+            <m:ctrlPr>
+              <w:rPr>
+                <w:rFonts w:ascii="Cambria Math" w:hAnsi="Cambria Math"/>
+              </w:rPr>
+            </m:ctrlPr>
+          </m:sSubPr>
+          <m:e>
+            <m:r>
+              <w:rPr>
+                <w:rFonts w:ascii="Cambria Math" w:hAnsi="Cambria Math"/>
+              </w:rPr>
+              <m:t>B</m:t>
+            </m:r>
+          </m:e>
+          <m:sub>
+            <m:r>
+              <w:rPr>
+                <w:rFonts w:ascii="Cambria Math" w:hAnsi="Cambria Math"/>
+              </w:rPr>
+              <m:t>bend</m:t>
+            </m:r>
+          </m:sub>
+        </m:sSub>
+        <m:r>
+          <m:rPr>
+            <m:sty m:val="p"/>
+          </m:rPr>
+          <w:rPr>
+            <w:rFonts w:ascii="Cambria Math" w:hAnsi="Cambria Math"/>
+          </w:rPr>
+          <m:t>=</m:t>
+        </m:r>
+        <m:f>
+          <m:fPr>
+            <m:ctrlPr>
+              <w:rPr>
+                <w:rFonts w:ascii="Cambria Math" w:hAnsi="Cambria Math"/>
+              </w:rPr>
+            </m:ctrlPr>
+          </m:fPr>
+          <m:num>
+            <m:r>
+              <w:rPr>
+                <w:rFonts w:ascii="Cambria Math" w:hAnsi="Cambria Math"/>
+              </w:rPr>
+              <m:t>A</m:t>
+            </m:r>
+            <m:r>
+              <m:rPr>
+                <m:sty m:val="p"/>
+              </m:rPr>
+              <w:rPr>
+                <w:rFonts w:ascii="Cambria Math" w:hAnsi="Cambria Math"/>
+              </w:rPr>
+              <m:t>⋅</m:t>
+            </m:r>
+            <m:r>
+              <w:rPr>
+                <w:rFonts w:ascii="Cambria Math" w:hAnsi="Cambria Math"/>
+              </w:rPr>
+              <m:t>mcγβ</m:t>
+            </m:r>
+          </m:num>
+          <m:den>
+            <m:r>
+              <w:rPr>
+                <w:rFonts w:ascii="Cambria Math" w:hAnsi="Cambria Math"/>
+              </w:rPr>
+              <m:t>eZ</m:t>
+            </m:r>
+          </m:den>
+        </m:f>
+        <m:r>
+          <m:rPr>
+            <m:sty m:val="p"/>
+          </m:rPr>
+          <w:rPr>
+            <w:rFonts w:ascii="Cambria Math" w:hAnsi="Cambria Math"/>
+          </w:rPr>
+          <m:t>≈45</m:t>
+        </m:r>
+      </m:oMath>
+      <w:r>
+        <w:rPr>
+          <w:rFonts w:ascii="Times New Roman" w:eastAsiaTheme="minorEastAsia" w:hAnsi="Times New Roman" w:cs="Times New Roman"/>
+        </w:rPr>
+        <w:t xml:space="preserve"> </w:t>
+      </w:r>
+      <w:r>
+        <w:rPr>
+          <w:rFonts w:ascii="Times New Roman" w:eastAsiaTheme="minorEastAsia" w:hAnsi="Times New Roman" w:cs="Times New Roman"/>
+        </w:rPr>
+        <w:t xml:space="preserve">для любых частиц при максимальном магнитном поле в поворотных магнитах. Тем самым, определяется максимально возможная энергия для протонов </w:t>
+      </w:r>
+      <m:oMath>
+        <m:sSubSup>
+          <m:sSubSupPr>
+            <m:ctrlPr>
+              <w:rPr>
+                <w:rFonts w:ascii="Cambria Math" w:hAnsi="Cambria Math" w:cs="Times New Roman"/>
+                <w:i/>
+              </w:rPr>
+            </m:ctrlPr>
+          </m:sSubSupPr>
+          <m:e>
+            <m:r>
+              <m:rPr>
+                <m:sty m:val="p"/>
+              </m:rPr>
+              <w:rPr>
+                <w:rFonts w:ascii="Cambria Math" w:hAnsi="Cambria Math" w:cs="Times New Roman"/>
+              </w:rPr>
+              <m:t>E</m:t>
+            </m:r>
+            <m:ctrlPr>
+              <w:rPr>
+                <w:rFonts w:ascii="Cambria Math" w:hAnsi="Cambria Math" w:cs="Times New Roman"/>
+              </w:rPr>
+            </m:ctrlPr>
+          </m:e>
+          <m:sub>
+            <m:r>
+              <w:rPr>
+                <w:rFonts w:ascii="Cambria Math" w:hAnsi="Cambria Math" w:cs="Times New Roman"/>
+                <w:lang w:val="en-US"/>
+              </w:rPr>
+              <m:t>max</m:t>
+            </m:r>
+          </m:sub>
+          <m:sup>
+            <m:r>
+              <w:rPr>
+                <w:rFonts w:ascii="Cambria Math" w:hAnsi="Cambria Math" w:cs="Times New Roman"/>
+              </w:rPr>
+              <m:t>p</m:t>
+            </m:r>
+          </m:sup>
+        </m:sSubSup>
+        <m:r>
+          <w:rPr>
+            <w:rFonts w:ascii="Cambria Math" w:hAnsi="Cambria Math" w:cs="Times New Roman"/>
+          </w:rPr>
+          <m:t>=</m:t>
+        </m:r>
+        <m:r>
+          <w:rPr>
+            <w:rFonts w:ascii="Cambria Math" w:hAnsi="Cambria Math" w:cs="Times New Roman"/>
+          </w:rPr>
+          <m:t>1</m:t>
+        </m:r>
+        <m:r>
+          <w:rPr>
+            <w:rFonts w:ascii="Cambria Math" w:hAnsi="Cambria Math" w:cs="Times New Roman"/>
+          </w:rPr>
+          <m:t>2</m:t>
+        </m:r>
+        <m:r>
+          <w:rPr>
+            <w:rFonts w:ascii="Cambria Math" w:hAnsi="Cambria Math" w:cs="Times New Roman"/>
+          </w:rPr>
+          <m:t>,</m:t>
+        </m:r>
+        <m:r>
+          <w:rPr>
+            <w:rFonts w:ascii="Cambria Math" w:hAnsi="Cambria Math" w:cs="Times New Roman"/>
+          </w:rPr>
+          <m:t>4</m:t>
+        </m:r>
+        <m:r>
+          <w:rPr>
+            <w:rFonts w:ascii="Cambria Math" w:hAnsi="Cambria Math" w:cs="Times New Roman"/>
+          </w:rPr>
+          <m:t xml:space="preserve"> </m:t>
+        </m:r>
+        <m:r>
+          <w:rPr>
+            <w:rFonts w:ascii="Cambria Math" w:eastAsiaTheme="minorEastAsia" w:hAnsi="Cambria Math" w:cs="Times New Roman"/>
+          </w:rPr>
+          <m:t>ГэВ</m:t>
+        </m:r>
+      </m:oMath>
+      <w:r>
+        <w:rPr>
+          <w:rFonts w:ascii="Times New Roman" w:eastAsiaTheme="minorEastAsia" w:hAnsi="Times New Roman" w:cs="Times New Roman"/>
+        </w:rPr>
+        <w:t xml:space="preserve"> (</w:t>
+      </w:r>
+      <m:oMath>
+        <m:sSubSup>
+          <m:sSubSupPr>
+            <m:ctrlPr>
+              <w:rPr>
+                <w:rFonts w:ascii="Cambria Math" w:hAnsi="Cambria Math" w:cs="Times New Roman"/>
+                <w:i/>
+              </w:rPr>
+            </m:ctrlPr>
+          </m:sSubSupPr>
+          <m:e>
+            <m:r>
+              <m:rPr>
+                <m:sty m:val="p"/>
+              </m:rPr>
+              <w:rPr>
+                <w:rFonts w:ascii="Cambria Math" w:hAnsi="Cambria Math" w:cs="Times New Roman"/>
+              </w:rPr>
+              <m:t>γ</m:t>
+            </m:r>
+            <m:ctrlPr>
+              <w:rPr>
+                <w:rFonts w:ascii="Cambria Math" w:hAnsi="Cambria Math" w:cs="Times New Roman"/>
+              </w:rPr>
+            </m:ctrlPr>
+          </m:e>
+          <m:sub>
+            <m:r>
+              <w:rPr>
+                <w:rFonts w:ascii="Cambria Math" w:hAnsi="Cambria Math" w:cs="Times New Roman"/>
+              </w:rPr>
+              <m:t>tr</m:t>
+            </m:r>
+          </m:sub>
+          <m:sup>
+            <m:r>
+              <w:rPr>
+                <w:rFonts w:ascii="Cambria Math" w:hAnsi="Cambria Math" w:cs="Times New Roman"/>
+              </w:rPr>
+              <m:t>Au</m:t>
+            </m:r>
+            <m:r>
+              <w:rPr>
+                <w:rFonts w:ascii="Cambria Math" w:hAnsi="Cambria Math" w:cs="Times New Roman"/>
+              </w:rPr>
+              <m:t>-</m:t>
+            </m:r>
+            <m:r>
+              <w:rPr>
+                <w:rFonts w:ascii="Cambria Math" w:hAnsi="Cambria Math" w:cs="Times New Roman"/>
+              </w:rPr>
+              <m:t>Au</m:t>
+            </m:r>
+          </m:sup>
+        </m:sSubSup>
+        <m:r>
+          <w:rPr>
+            <w:rFonts w:ascii="Cambria Math" w:hAnsi="Cambria Math" w:cs="Times New Roman"/>
+          </w:rPr>
+          <m:t>=</m:t>
+        </m:r>
+        <m:r>
+          <w:rPr>
+            <w:rFonts w:ascii="Cambria Math" w:hAnsi="Cambria Math" w:cs="Times New Roman"/>
+          </w:rPr>
+          <m:t>14</m:t>
+        </m:r>
+        <m:r>
+          <w:rPr>
+            <w:rFonts w:ascii="Cambria Math" w:hAnsi="Cambria Math" w:cs="Times New Roman"/>
+          </w:rPr>
+          <m:t>,</m:t>
+        </m:r>
+        <m:r>
+          <w:rPr>
+            <w:rFonts w:ascii="Cambria Math" w:hAnsi="Cambria Math" w:cs="Times New Roman"/>
+          </w:rPr>
+          <m:t>3</m:t>
+        </m:r>
+      </m:oMath>
+      <w:r>
+        <w:rPr>
+          <w:rFonts w:ascii="Times New Roman" w:eastAsiaTheme="minorEastAsia" w:hAnsi="Times New Roman" w:cs="Times New Roman"/>
+        </w:rPr>
+        <w:t>)</w:t>
+      </w:r>
+      <w:r>
+        <w:rPr>
+          <w:rFonts w:ascii="Times New Roman" w:eastAsiaTheme="minorEastAsia" w:hAnsi="Times New Roman" w:cs="Times New Roman"/>
+        </w:rPr>
+        <w:t xml:space="preserve">, что заведомо выше критической энергии для ионной регулярной структуры </w:t>
+      </w:r>
+      <m:oMath>
+        <m:sSubSup>
+          <m:sSubSupPr>
+            <m:ctrlPr>
+              <w:rPr>
+                <w:rFonts w:ascii="Cambria Math" w:hAnsi="Cambria Math" w:cs="Times New Roman"/>
+                <w:i/>
+              </w:rPr>
+            </m:ctrlPr>
+          </m:sSubSupPr>
+          <m:e>
+            <m:r>
+              <m:rPr>
+                <m:sty m:val="p"/>
+              </m:rPr>
+              <w:rPr>
+                <w:rFonts w:ascii="Cambria Math" w:hAnsi="Cambria Math" w:cs="Times New Roman"/>
+              </w:rPr>
+              <m:t>E</m:t>
+            </m:r>
+            <m:ctrlPr>
+              <w:rPr>
+                <w:rFonts w:ascii="Cambria Math" w:hAnsi="Cambria Math" w:cs="Times New Roman"/>
+              </w:rPr>
+            </m:ctrlPr>
+          </m:e>
+          <m:sub>
+            <m:r>
+              <w:rPr>
+                <w:rFonts w:ascii="Cambria Math" w:hAnsi="Cambria Math" w:cs="Times New Roman"/>
+              </w:rPr>
+              <m:t>tr</m:t>
+            </m:r>
+          </m:sub>
+          <m:sup>
+            <m:r>
+              <w:rPr>
+                <w:rFonts w:ascii="Cambria Math" w:hAnsi="Cambria Math" w:cs="Times New Roman"/>
+              </w:rPr>
+              <m:t>Au</m:t>
+            </m:r>
+            <m:r>
+              <w:rPr>
+                <w:rFonts w:ascii="Cambria Math" w:hAnsi="Cambria Math" w:cs="Times New Roman"/>
+              </w:rPr>
+              <m:t>-</m:t>
+            </m:r>
+            <m:r>
+              <w:rPr>
+                <w:rFonts w:ascii="Cambria Math" w:hAnsi="Cambria Math" w:cs="Times New Roman"/>
+              </w:rPr>
+              <m:t>Au</m:t>
+            </m:r>
+          </m:sup>
+        </m:sSubSup>
+        <m:r>
+          <w:rPr>
+            <w:rFonts w:ascii="Cambria Math" w:hAnsi="Cambria Math" w:cs="Times New Roman"/>
+          </w:rPr>
+          <m:t>=5,</m:t>
+        </m:r>
+        <m:r>
+          <w:rPr>
+            <w:rFonts w:ascii="Cambria Math" w:hAnsi="Cambria Math" w:cs="Times New Roman"/>
+          </w:rPr>
+          <m:t>7</m:t>
+        </m:r>
+        <m:r>
+          <w:rPr>
+            <w:rFonts w:ascii="Cambria Math" w:hAnsi="Cambria Math" w:cs="Times New Roman"/>
+          </w:rPr>
+          <m:t xml:space="preserve"> </m:t>
+        </m:r>
+        <m:r>
+          <w:rPr>
+            <w:rFonts w:ascii="Cambria Math" w:eastAsiaTheme="minorEastAsia" w:hAnsi="Cambria Math" w:cs="Times New Roman"/>
+          </w:rPr>
+          <m:t>ГэВ</m:t>
+        </m:r>
+      </m:oMath>
+      <w:r>
+        <w:rPr>
+          <w:rFonts w:ascii="Times New Roman" w:eastAsiaTheme="minorEastAsia" w:hAnsi="Times New Roman" w:cs="Times New Roman"/>
+        </w:rPr>
+        <w:t xml:space="preserve"> </w:t>
+      </w:r>
+      <w:r>
+        <w:rPr>
+          <w:rFonts w:ascii="Times New Roman" w:hAnsi="Times New Roman" w:cs="Times New Roman"/>
+        </w:rPr>
+        <w:t xml:space="preserve">( </w:t>
+      </w:r>
+      <m:oMath>
+        <m:sSubSup>
+          <m:sSubSupPr>
+            <m:ctrlPr>
+              <w:rPr>
+                <w:rFonts w:ascii="Cambria Math" w:hAnsi="Cambria Math" w:cs="Times New Roman"/>
+                <w:i/>
+              </w:rPr>
+            </m:ctrlPr>
+          </m:sSubSupPr>
+          <m:e>
+            <m:r>
+              <m:rPr>
+                <m:sty m:val="p"/>
+              </m:rPr>
+              <w:rPr>
+                <w:rFonts w:ascii="Cambria Math" w:hAnsi="Cambria Math" w:cs="Times New Roman"/>
+              </w:rPr>
+              <m:t>γ</m:t>
+            </m:r>
+            <m:ctrlPr>
+              <w:rPr>
+                <w:rFonts w:ascii="Cambria Math" w:hAnsi="Cambria Math" w:cs="Times New Roman"/>
+              </w:rPr>
+            </m:ctrlPr>
+          </m:e>
+          <m:sub>
+            <m:r>
+              <w:rPr>
+                <w:rFonts w:ascii="Cambria Math" w:hAnsi="Cambria Math" w:cs="Times New Roman"/>
+              </w:rPr>
+              <m:t>tr</m:t>
+            </m:r>
+          </m:sub>
+          <m:sup>
+            <m:r>
+              <w:rPr>
+                <w:rFonts w:ascii="Cambria Math" w:hAnsi="Cambria Math" w:cs="Times New Roman"/>
+              </w:rPr>
+              <m:t>Au</m:t>
+            </m:r>
+            <m:r>
+              <w:rPr>
+                <w:rFonts w:ascii="Cambria Math" w:hAnsi="Cambria Math" w:cs="Times New Roman"/>
+              </w:rPr>
+              <m:t>-</m:t>
+            </m:r>
+            <m:r>
+              <w:rPr>
+                <w:rFonts w:ascii="Cambria Math" w:hAnsi="Cambria Math" w:cs="Times New Roman"/>
+              </w:rPr>
+              <m:t>Au</m:t>
+            </m:r>
+          </m:sup>
+        </m:sSubSup>
+        <m:r>
+          <w:rPr>
+            <w:rFonts w:ascii="Cambria Math" w:hAnsi="Cambria Math" w:cs="Times New Roman"/>
+          </w:rPr>
+          <m:t>=7</m:t>
+        </m:r>
+        <m:r>
+          <w:rPr>
+            <w:rFonts w:ascii="Cambria Math" w:hAnsi="Cambria Math" w:cs="Times New Roman"/>
+          </w:rPr>
+          <m:t>,1</m:t>
+        </m:r>
+      </m:oMath>
+      <w:r>
+        <w:rPr>
+          <w:rFonts w:ascii="Times New Roman" w:eastAsiaTheme="minorEastAsia" w:hAnsi="Times New Roman" w:cs="Times New Roman"/>
+        </w:rPr>
+        <w:t xml:space="preserve">). </w:t>
+      </w:r>
+      <w:r>
+        <w:rPr>
+          <w:rFonts w:ascii="Times New Roman" w:eastAsiaTheme="minorEastAsia" w:hAnsi="Times New Roman" w:cs="Times New Roman"/>
+        </w:rPr>
+        <w:t xml:space="preserve">Таким образом, для ускорения протонов необходимо либо скачкообразное прохождение через критическую энергию, либо поднятие критической энергии до величины </w:t>
+      </w:r>
+      <m:oMath>
+        <m:sSubSup>
+          <m:sSubSupPr>
+            <m:ctrlPr>
+              <w:rPr>
+                <w:rFonts w:ascii="Cambria Math" w:hAnsi="Cambria Math"/>
+              </w:rPr>
+            </m:ctrlPr>
+          </m:sSubSupPr>
+          <m:e>
+            <m:r>
+              <w:rPr>
+                <w:rFonts w:ascii="Cambria Math" w:hAnsi="Cambria Math"/>
+              </w:rPr>
+              <m:t>γ</m:t>
+            </m:r>
+          </m:e>
+          <m:sub>
+            <m:r>
+              <w:rPr>
+                <w:rFonts w:ascii="Cambria Math" w:hAnsi="Cambria Math"/>
+                <w:lang w:val="en-US"/>
+              </w:rPr>
+              <m:t>tr</m:t>
+            </m:r>
+          </m:sub>
+          <m:sup>
+            <m:r>
+              <w:rPr>
+                <w:rFonts w:ascii="Cambria Math" w:hAnsi="Cambria Math"/>
+              </w:rPr>
+              <m:t>p</m:t>
+            </m:r>
+          </m:sup>
+        </m:sSubSup>
+        <m:r>
+          <m:rPr>
+            <m:sty m:val="p"/>
+          </m:rPr>
+          <w:rPr>
+            <w:rFonts w:ascii="Cambria Math" w:hAnsi="Cambria Math"/>
+          </w:rPr>
+          <m:t>&gt;</m:t>
+        </m:r>
+        <m:sSubSup>
+          <m:sSubSupPr>
+            <m:ctrlPr>
+              <w:rPr>
+                <w:rFonts w:ascii="Cambria Math" w:hAnsi="Cambria Math"/>
+              </w:rPr>
+            </m:ctrlPr>
+          </m:sSubSupPr>
+          <m:e>
+            <m:r>
+              <w:rPr>
+                <w:rFonts w:ascii="Cambria Math" w:hAnsi="Cambria Math"/>
+              </w:rPr>
+              <m:t>γ</m:t>
+            </m:r>
+          </m:e>
+          <m:sub>
+            <m:r>
+              <w:rPr>
+                <w:rFonts w:ascii="Cambria Math" w:hAnsi="Cambria Math"/>
+              </w:rPr>
+              <m:t>max</m:t>
+            </m:r>
+          </m:sub>
+          <m:sup>
+            <m:r>
+              <w:rPr>
+                <w:rFonts w:ascii="Cambria Math" w:hAnsi="Cambria Math"/>
+              </w:rPr>
+              <m:t>p</m:t>
+            </m:r>
+          </m:sup>
+        </m:sSubSup>
+        <m:r>
+          <m:rPr>
+            <m:sty m:val="p"/>
+          </m:rPr>
+          <w:rPr>
+            <w:rFonts w:ascii="Cambria Math" w:hAnsi="Cambria Math"/>
+          </w:rPr>
+          <m:t>=</m:t>
+        </m:r>
+        <m:r>
+          <m:rPr>
+            <m:sty m:val="p"/>
+          </m:rPr>
+          <w:rPr>
+            <w:rFonts w:ascii="Cambria Math" w:hAnsi="Cambria Math"/>
+          </w:rPr>
+          <m:t>14.</m:t>
+        </m:r>
+        <m:r>
+          <m:rPr>
+            <m:sty m:val="p"/>
+          </m:rPr>
+          <w:rPr>
+            <w:rFonts w:ascii="Cambria Math" w:hAnsi="Cambria Math"/>
+          </w:rPr>
+          <m:t>3</m:t>
+        </m:r>
+      </m:oMath>
+      <w:r>
+        <w:rPr>
+          <w:rFonts w:ascii="Times New Roman" w:eastAsiaTheme="minorEastAsia" w:hAnsi="Times New Roman" w:cs="Times New Roman"/>
+        </w:rPr>
+        <w:t xml:space="preserve">. </w:t>
+      </w:r>
     </w:p>
     <w:p>
       <w:pPr>
         <w:rPr>
-          <w:rFonts w:eastAsiaTheme="minorEastAsia"/>
+          <w:rFonts w:ascii="Times New Roman" w:hAnsi="Times New Roman" w:cs="Times New Roman"/>
         </w:rPr>
       </w:pPr>
     </w:p>
-    <w:p>
-      <w:pPr>
-        <w:rPr>
-          <w:rFonts w:eastAsiaTheme="minorEastAsia"/>
-        </w:rPr>
-      </w:pPr>
-    </w:p>
-    <w:p/>
-    <w:p/>
     <w:p>
       <w:pPr>
         <w:pStyle w:val="a5"/>
@@ -224,18 +1452,78 @@
           <w:ilvl w:val="0"/>
           <w:numId w:val="1"/>
         </w:numPr>
-      </w:pPr>
-      <w:r>
-        <w:t xml:space="preserve">Модуляция дисперсионной функции в </w:t>
-      </w:r>
-      <w:proofErr w:type="spellStart"/>
-      <w:r>
-        <w:t>суперпероде</w:t>
-      </w:r>
-      <w:proofErr w:type="spellEnd"/>
+        <w:rPr>
+          <w:rFonts w:ascii="Times New Roman" w:hAnsi="Times New Roman" w:cs="Times New Roman"/>
+          <w:b/>
+          <w:bCs/>
+        </w:rPr>
+      </w:pPr>
+      <w:r>
+        <w:rPr>
+          <w:rFonts w:ascii="Times New Roman" w:hAnsi="Times New Roman" w:cs="Times New Roman"/>
+          <w:b/>
+          <w:bCs/>
+        </w:rPr>
+        <w:t>Модуляция дисперсионной функции</w:t>
+      </w:r>
     </w:p>
-    <w:p/>
-    <w:p/>
+    <w:p>
+      <w:pPr>
+        <w:rPr>
+          <w:rFonts w:ascii="Times New Roman" w:hAnsi="Times New Roman" w:cs="Times New Roman"/>
+          <w:b/>
+          <w:bCs/>
+        </w:rPr>
+      </w:pPr>
+    </w:p>
+    <w:p>
+      <w:pPr>
+        <w:rPr>
+          <w:rFonts w:ascii="Times New Roman" w:hAnsi="Times New Roman" w:cs="Times New Roman"/>
+          <w:b/>
+          <w:bCs/>
+          <w:lang w:val="en-US"/>
+        </w:rPr>
+      </w:pPr>
+    </w:p>
+    <w:p>
+      <w:pPr>
+        <w:ind w:left="360"/>
+        <w:rPr>
+          <w:rFonts w:ascii="Times New Roman" w:hAnsi="Times New Roman" w:cs="Times New Roman"/>
+        </w:rPr>
+      </w:pPr>
+    </w:p>
+    <w:p>
+      <w:pPr>
+        <w:pStyle w:val="a5"/>
+        <w:rPr>
+          <w:rFonts w:ascii="Times New Roman" w:hAnsi="Times New Roman" w:cs="Times New Roman"/>
+        </w:rPr>
+      </w:pPr>
+    </w:p>
+    <w:p>
+      <w:pPr>
+        <w:pStyle w:val="a5"/>
+        <w:rPr>
+          <w:rFonts w:ascii="Times New Roman" w:hAnsi="Times New Roman" w:cs="Times New Roman"/>
+        </w:rPr>
+      </w:pPr>
+    </w:p>
+    <w:p>
+      <w:pPr>
+        <w:rPr>
+          <w:rFonts w:ascii="Times New Roman" w:hAnsi="Times New Roman" w:cs="Times New Roman"/>
+        </w:rPr>
+      </w:pPr>
+    </w:p>
+    <w:p>
+      <w:pPr>
+        <w:rPr>
+          <w:rFonts w:ascii="Times New Roman" w:hAnsi="Times New Roman" w:cs="Times New Roman"/>
+        </w:rPr>
+      </w:pPr>
+    </w:p>
     <w:sectPr>
       <w:pgSz w:w="11906" w:h="16838"/>
       <w:pgMar w:top="1134" w:right="850" w:bottom="1134" w:left="1701" w:header="708" w:footer="708" w:gutter="0"/>

</xml_diff>

<commit_message>
Add a huge number of structures for 9,44x9,44 and now try to choose right position for sextupoles
</commit_message>
<xml_diff>
--- a/Conference/Вариация критической энергии в применении к ускорительному комплексу NICA.docx
+++ b/Conference/Вариация критической энергии в применении к ускорительному комплексу NICA.docx
@@ -5,6 +5,8 @@
     <w:p>
       <w:pPr>
         <w:jc w:val="center"/>
+      </w:pPr>
+      <w:r>
         <w:rPr>
           <w:rFonts w:ascii="Times New Roman" w:eastAsiaTheme="majorEastAsia" w:hAnsi="Times New Roman" w:cs="Times New Roman"/>
           <w:b/>
@@ -14,70 +16,9 @@
           <w:sz w:val="28"/>
           <w:szCs w:val="28"/>
         </w:rPr>
-      </w:pPr>
-      <w:r>
-        <w:rPr>
-          <w:rFonts w:ascii="Times New Roman" w:eastAsiaTheme="majorEastAsia" w:hAnsi="Times New Roman" w:cs="Times New Roman"/>
-          <w:b/>
-          <w:bCs/>
-          <w:spacing w:val="-10"/>
-          <w:kern w:val="28"/>
-          <w:sz w:val="28"/>
-          <w:szCs w:val="28"/>
-        </w:rPr>
-        <w:t xml:space="preserve">Возможные методы прохождения критической энергии в ускорительном комплексе </w:t>
-      </w:r>
-      <w:r>
-        <w:rPr>
-          <w:rFonts w:ascii="Times New Roman" w:eastAsiaTheme="majorEastAsia" w:hAnsi="Times New Roman" w:cs="Times New Roman"/>
-          <w:b/>
-          <w:bCs/>
-          <w:spacing w:val="-10"/>
-          <w:kern w:val="28"/>
-          <w:sz w:val="28"/>
-          <w:szCs w:val="28"/>
-          <w:lang w:val="en-US"/>
-        </w:rPr>
-        <w:t>NICA</w:t>
-      </w:r>
-      <w:r>
-        <w:rPr>
-          <w:rFonts w:ascii="Times New Roman" w:eastAsiaTheme="majorEastAsia" w:hAnsi="Times New Roman" w:cs="Times New Roman"/>
-          <w:b/>
-          <w:bCs/>
-          <w:spacing w:val="-10"/>
-          <w:kern w:val="28"/>
-          <w:sz w:val="28"/>
-          <w:szCs w:val="28"/>
-        </w:rPr>
-        <w:t xml:space="preserve"> </w:t>
-      </w:r>
-      <w:r>
-        <w:rPr>
-          <w:rFonts w:ascii="Times New Roman" w:eastAsiaTheme="majorEastAsia" w:hAnsi="Times New Roman" w:cs="Times New Roman"/>
-          <w:b/>
-          <w:bCs/>
-          <w:spacing w:val="-10"/>
-          <w:kern w:val="28"/>
-          <w:sz w:val="28"/>
-          <w:szCs w:val="28"/>
-        </w:rPr>
-        <w:t>для поляризованного протонного пучка</w:t>
-      </w:r>
-      <w:r>
-        <w:rPr>
-          <w:rFonts w:ascii="Times New Roman" w:eastAsiaTheme="majorEastAsia" w:hAnsi="Times New Roman" w:cs="Times New Roman"/>
-          <w:b/>
-          <w:bCs/>
-          <w:spacing w:val="-10"/>
-          <w:kern w:val="28"/>
-          <w:sz w:val="28"/>
-          <w:szCs w:val="28"/>
-        </w:rPr>
-        <w:t>.</w:t>
-      </w:r>
-    </w:p>
-    <w:p/>
+        <w:t>Вариация критической энергии в применении к ускорительному комплексу NICA.</w:t>
+      </w:r>
+    </w:p>
     <w:p>
       <w:pPr>
         <w:jc w:val="center"/>
@@ -1872,6 +1813,7 @@
         <w:rPr>
           <w:rFonts w:ascii="Times New Roman" w:hAnsi="Times New Roman" w:cs="Times New Roman"/>
         </w:rPr>
+        <w:lastRenderedPageBreak/>
         <w:t>г</w:t>
       </w:r>
       <w:r>
@@ -4895,6 +4837,14 @@
         </w:rPr>
         <w:t>.</w:t>
       </w:r>
+    </w:p>
+    <w:p>
+      <w:pPr>
+        <w:ind w:firstLine="360"/>
+        <w:rPr>
+          <w:rFonts w:ascii="Times New Roman" w:hAnsi="Times New Roman" w:cs="Times New Roman"/>
+        </w:rPr>
+      </w:pPr>
       <w:r>
         <w:rPr>
           <w:rFonts w:ascii="Times New Roman" w:hAnsi="Times New Roman" w:cs="Times New Roman"/>
@@ -5150,6 +5100,30 @@
           <w:iCs/>
         </w:rPr>
       </w:pPr>
+    </w:p>
+    <w:p>
+      <w:pPr>
+        <w:rPr>
+          <w:rFonts w:ascii="Times New Roman" w:eastAsiaTheme="minorEastAsia" w:hAnsi="Times New Roman" w:cs="Times New Roman"/>
+          <w:iCs/>
+        </w:rPr>
+        <w:sectPr>
+          <w:type w:val="continuous"/>
+          <w:pgSz w:w="11906" w:h="16838"/>
+          <w:pgMar w:top="1134" w:right="850" w:bottom="1134" w:left="1701" w:header="708" w:footer="708" w:gutter="0"/>
+          <w:cols w:space="708"/>
+          <w:docGrid w:linePitch="360"/>
+        </w:sectPr>
+      </w:pPr>
+    </w:p>
+    <w:p>
+      <w:pPr>
+        <w:jc w:val="center"/>
+        <w:rPr>
+          <w:rFonts w:ascii="Times New Roman" w:eastAsiaTheme="minorEastAsia" w:hAnsi="Times New Roman" w:cs="Times New Roman"/>
+          <w:iCs/>
+        </w:rPr>
+      </w:pPr>
       <w:r>
         <w:rPr>
           <w:rFonts w:ascii="Times New Roman" w:eastAsiaTheme="minorEastAsia" w:hAnsi="Times New Roman" w:cs="Times New Roman"/>
@@ -5160,13 +5134,13 @@
           <wp:anchor distT="0" distB="0" distL="114300" distR="114300" simplePos="0" relativeHeight="251658240" behindDoc="0" locked="0" layoutInCell="1" allowOverlap="1" wp14:anchorId="0393E040">
             <wp:simplePos x="0" y="0"/>
             <wp:positionH relativeFrom="margin">
-              <wp:posOffset>139065</wp:posOffset>
+              <wp:posOffset>138619</wp:posOffset>
             </wp:positionH>
             <wp:positionV relativeFrom="margin">
-              <wp:posOffset>3053640</wp:posOffset>
+              <wp:posOffset>2849245</wp:posOffset>
             </wp:positionV>
             <wp:extent cx="2599690" cy="2150745"/>
-            <wp:effectExtent l="0" t="0" r="3810" b="0"/>
+            <wp:effectExtent l="0" t="0" r="3175" b="6350"/>
             <wp:wrapSquare wrapText="bothSides"/>
             <wp:docPr id="5" name="Рисунок 5"/>
             <wp:cNvGraphicFramePr>
@@ -5203,6 +5177,12 @@
                 </pic:pic>
               </a:graphicData>
             </a:graphic>
+            <wp14:sizeRelH relativeFrom="margin">
+              <wp14:pctWidth>0</wp14:pctWidth>
+            </wp14:sizeRelH>
+            <wp14:sizeRelV relativeFrom="margin">
+              <wp14:pctHeight>0</wp14:pctHeight>
+            </wp14:sizeRelV>
           </wp:anchor>
         </w:drawing>
       </w:r>
@@ -5216,13 +5196,13 @@
           <wp:anchor distT="0" distB="0" distL="114300" distR="114300" simplePos="0" relativeHeight="251662336" behindDoc="0" locked="0" layoutInCell="1" allowOverlap="1">
             <wp:simplePos x="0" y="0"/>
             <wp:positionH relativeFrom="column">
-              <wp:posOffset>3082552</wp:posOffset>
+              <wp:posOffset>3121025</wp:posOffset>
             </wp:positionH>
             <wp:positionV relativeFrom="paragraph">
-              <wp:posOffset>213734</wp:posOffset>
+              <wp:posOffset>212090</wp:posOffset>
             </wp:positionV>
-            <wp:extent cx="2667635" cy="2192655"/>
-            <wp:effectExtent l="0" t="0" r="0" b="4445"/>
+            <wp:extent cx="2626360" cy="2158365"/>
+            <wp:effectExtent l="0" t="0" r="2540" b="635"/>
             <wp:wrapSquare wrapText="bothSides"/>
             <wp:docPr id="10" name="Рисунок 10"/>
             <wp:cNvGraphicFramePr>
@@ -5250,7 +5230,7 @@
                   <pic:spPr>
                     <a:xfrm>
                       <a:off x="0" y="0"/>
-                      <a:ext cx="2667635" cy="2192655"/>
+                      <a:ext cx="2626360" cy="2158365"/>
                     </a:xfrm>
                     <a:prstGeom prst="rect">
                       <a:avLst/>
@@ -5268,21 +5248,6 @@
           </wp:anchor>
         </w:drawing>
       </w:r>
-    </w:p>
-    <w:p>
-      <w:pPr>
-        <w:rPr>
-          <w:rFonts w:ascii="Times New Roman" w:eastAsiaTheme="minorEastAsia" w:hAnsi="Times New Roman" w:cs="Times New Roman"/>
-          <w:iCs/>
-        </w:rPr>
-        <w:sectPr>
-          <w:type w:val="continuous"/>
-          <w:pgSz w:w="11906" w:h="16838"/>
-          <w:pgMar w:top="1134" w:right="850" w:bottom="1134" w:left="1701" w:header="708" w:footer="708" w:gutter="0"/>
-          <w:cols w:space="708"/>
-          <w:docGrid w:linePitch="360"/>
-        </w:sectPr>
-      </w:pPr>
     </w:p>
     <w:p>
       <w:pPr>
@@ -6705,6 +6670,14 @@
           <w:iCs/>
         </w:rPr>
       </w:pPr>
+    </w:p>
+    <w:p>
+      <w:pPr>
+        <w:rPr>
+          <w:rFonts w:ascii="Times New Roman" w:eastAsiaTheme="minorEastAsia" w:hAnsi="Times New Roman" w:cs="Times New Roman"/>
+          <w:iCs/>
+        </w:rPr>
+      </w:pPr>
       <w:r>
         <w:rPr>
           <w:rFonts w:ascii="Times New Roman" w:eastAsiaTheme="minorEastAsia" w:hAnsi="Times New Roman" w:cs="Times New Roman"/>
@@ -6715,10 +6688,10 @@
           <wp:anchor distT="0" distB="0" distL="114300" distR="114300" simplePos="0" relativeHeight="251660288" behindDoc="0" locked="0" layoutInCell="1" allowOverlap="1">
             <wp:simplePos x="0" y="0"/>
             <wp:positionH relativeFrom="margin">
-              <wp:posOffset>3306296</wp:posOffset>
+              <wp:posOffset>3305810</wp:posOffset>
             </wp:positionH>
             <wp:positionV relativeFrom="margin">
-              <wp:posOffset>6447304</wp:posOffset>
+              <wp:posOffset>6214927</wp:posOffset>
             </wp:positionV>
             <wp:extent cx="2428875" cy="1788160"/>
             <wp:effectExtent l="0" t="0" r="0" b="2540"/>
@@ -6761,14 +6734,6 @@
           </wp:anchor>
         </w:drawing>
       </w:r>
-    </w:p>
-    <w:p>
-      <w:pPr>
-        <w:rPr>
-          <w:rFonts w:ascii="Times New Roman" w:eastAsiaTheme="minorEastAsia" w:hAnsi="Times New Roman" w:cs="Times New Roman"/>
-          <w:iCs/>
-        </w:rPr>
-      </w:pPr>
       <w:r>
         <w:rPr>
           <w:rFonts w:ascii="Times New Roman" w:eastAsiaTheme="minorEastAsia" w:hAnsi="Times New Roman" w:cs="Times New Roman"/>
@@ -6955,6 +6920,15 @@
         </w:rPr>
         <w:t>.</w:t>
       </w:r>
+    </w:p>
+    <w:p>
+      <w:pPr>
+        <w:jc w:val="right"/>
+        <w:rPr>
+          <w:rFonts w:ascii="Times New Roman" w:eastAsiaTheme="minorEastAsia" w:hAnsi="Times New Roman" w:cs="Times New Roman"/>
+          <w:iCs/>
+        </w:rPr>
+      </w:pPr>
     </w:p>
     <w:p>
       <w:pPr>
@@ -7012,6 +6986,7 @@
                 <w:rFonts w:ascii="Times New Roman" w:eastAsiaTheme="minorEastAsia" w:hAnsi="Times New Roman" w:cs="Times New Roman"/>
                 <w:iCs/>
               </w:rPr>
+              <w:lastRenderedPageBreak/>
               <w:t>Квадруполи</w:t>
             </w:r>
           </w:p>
@@ -7070,7 +7045,6 @@
                 <w:iCs/>
                 <w:lang w:val="en-US"/>
               </w:rPr>
-              <w:lastRenderedPageBreak/>
               <w:t>QF</w:t>
             </w:r>
             <w:r>
@@ -8217,6 +8191,14 @@
     </w:p>
     <w:p>
       <w:pPr>
+        <w:rPr>
+          <w:rFonts w:ascii="Times New Roman" w:eastAsiaTheme="minorEastAsia" w:hAnsi="Times New Roman" w:cs="Times New Roman"/>
+          <w:iCs/>
+        </w:rPr>
+      </w:pPr>
+    </w:p>
+    <w:p>
+      <w:pPr>
         <w:ind w:firstLine="360"/>
         <w:rPr>
           <w:rFonts w:ascii="Times New Roman" w:eastAsiaTheme="minorEastAsia" w:hAnsi="Times New Roman" w:cs="Times New Roman"/>
@@ -8227,6 +8209,7 @@
           <w:rFonts w:ascii="Times New Roman" w:hAnsi="Times New Roman" w:cs="Times New Roman"/>
           <w:noProof/>
         </w:rPr>
+        <w:lastRenderedPageBreak/>
         <w:drawing>
           <wp:inline distT="0" distB="0" distL="0" distR="0" wp14:anchorId="5DA80286" wp14:editId="1175C4D8">
             <wp:extent cx="5305529" cy="1093432"/>

</xml_diff>

<commit_message>
Add Two variants of pNICA w g=15. 1) Edge suppressor; 2) Arc suppressor.
</commit_message>
<xml_diff>
--- a/Conference/Вариация критической энергии в применении к ускорительному комплексу NICA.docx
+++ b/Conference/Вариация критической энергии в применении к ускорительному комплексу NICA.docx
@@ -318,7 +318,13 @@
         <w:rPr>
           <w:rFonts w:ascii="Times New Roman" w:hAnsi="Times New Roman" w:cs="Times New Roman"/>
         </w:rPr>
-        <w:t xml:space="preserve">Для </w:t>
+        <w:t>В эксперименте по столкновению</w:t>
+      </w:r>
+      <w:r>
+        <w:rPr>
+          <w:rFonts w:ascii="Times New Roman" w:hAnsi="Times New Roman" w:cs="Times New Roman"/>
+        </w:rPr>
+        <w:t xml:space="preserve"> </w:t>
       </w:r>
       <w:r>
         <w:rPr>
@@ -422,25 +428,33 @@
         <w:rPr>
           <w:rFonts w:ascii="Times New Roman" w:hAnsi="Times New Roman" w:cs="Times New Roman"/>
         </w:rPr>
-        <w:t xml:space="preserve">ритическая энергия коллайдера </w:t>
-      </w:r>
-      <w:r>
-        <w:rPr>
-          <w:rFonts w:ascii="Times New Roman" w:hAnsi="Times New Roman" w:cs="Times New Roman"/>
-        </w:rPr>
-        <w:t>равн</w:t>
-      </w:r>
-      <w:r>
-        <w:rPr>
-          <w:rFonts w:ascii="Times New Roman" w:hAnsi="Times New Roman" w:cs="Times New Roman"/>
-        </w:rPr>
-        <w:t>а</w:t>
-      </w:r>
-      <w:r>
-        <w:rPr>
-          <w:rFonts w:ascii="Times New Roman" w:hAnsi="Times New Roman" w:cs="Times New Roman"/>
-        </w:rPr>
-        <w:t xml:space="preserve"> </w:t>
+        <w:t xml:space="preserve">ритическая энергия </w:t>
+      </w:r>
+      <w:proofErr w:type="spellStart"/>
+      <w:r>
+        <w:rPr>
+          <w:rFonts w:ascii="Times New Roman" w:hAnsi="Times New Roman" w:cs="Times New Roman"/>
+        </w:rPr>
+        <w:t>магнито</w:t>
+      </w:r>
+      <w:proofErr w:type="spellEnd"/>
+      <w:r>
+        <w:rPr>
+          <w:rFonts w:ascii="Times New Roman" w:hAnsi="Times New Roman" w:cs="Times New Roman"/>
+        </w:rPr>
+        <w:t xml:space="preserve">-оптической </w:t>
+      </w:r>
+      <w:r>
+        <w:rPr>
+          <w:rFonts w:ascii="Times New Roman" w:hAnsi="Times New Roman" w:cs="Times New Roman"/>
+        </w:rPr>
+        <w:t xml:space="preserve">коллайдера </w:t>
+      </w:r>
+      <w:r>
+        <w:rPr>
+          <w:rFonts w:ascii="Times New Roman" w:hAnsi="Times New Roman" w:cs="Times New Roman"/>
+        </w:rPr>
+        <w:t xml:space="preserve">составляет </w:t>
       </w:r>
       <m:oMath>
         <m:sSubSup>
@@ -873,14 +887,33 @@
       <w:pPr>
         <w:ind w:firstLine="360"/>
         <w:rPr>
-          <w:rFonts w:ascii="Times New Roman" w:hAnsi="Times New Roman" w:cs="Times New Roman"/>
-        </w:rPr>
-      </w:pPr>
-      <w:r>
-        <w:rPr>
-          <w:rFonts w:ascii="Times New Roman" w:eastAsiaTheme="minorEastAsia" w:hAnsi="Times New Roman" w:cs="Times New Roman"/>
-        </w:rPr>
-        <w:t xml:space="preserve">При ускорении протонов магнитная жесткость в поворотных арках остаётся неизменной </w:t>
+          <w:rFonts w:ascii="Times New Roman" w:eastAsiaTheme="minorEastAsia" w:hAnsi="Times New Roman" w:cs="Times New Roman"/>
+          <w:lang w:val="en-US"/>
+        </w:rPr>
+      </w:pPr>
+      <w:r>
+        <w:rPr>
+          <w:rFonts w:ascii="Times New Roman" w:eastAsiaTheme="minorEastAsia" w:hAnsi="Times New Roman" w:cs="Times New Roman"/>
+        </w:rPr>
+        <w:t>М</w:t>
+      </w:r>
+      <w:r>
+        <w:rPr>
+          <w:rFonts w:ascii="Times New Roman" w:eastAsiaTheme="minorEastAsia" w:hAnsi="Times New Roman" w:cs="Times New Roman"/>
+        </w:rPr>
+        <w:t xml:space="preserve">агнитная жесткость поворотных </w:t>
+      </w:r>
+      <w:r>
+        <w:rPr>
+          <w:rFonts w:ascii="Times New Roman" w:eastAsiaTheme="minorEastAsia" w:hAnsi="Times New Roman" w:cs="Times New Roman"/>
+        </w:rPr>
+        <w:t xml:space="preserve">магнитов </w:t>
+      </w:r>
+      <w:r>
+        <w:rPr>
+          <w:rFonts w:ascii="Times New Roman" w:eastAsiaTheme="minorEastAsia" w:hAnsi="Times New Roman" w:cs="Times New Roman"/>
+        </w:rPr>
+        <w:t xml:space="preserve">постоянна </w:t>
       </w:r>
       <m:oMath>
         <m:sSub>
@@ -1005,13 +1038,7 @@
         <w:rPr>
           <w:rFonts w:ascii="Times New Roman" w:eastAsiaTheme="minorEastAsia" w:hAnsi="Times New Roman" w:cs="Times New Roman"/>
         </w:rPr>
-        <w:t xml:space="preserve"> </w:t>
-      </w:r>
-      <w:r>
-        <w:rPr>
-          <w:rFonts w:ascii="Times New Roman" w:eastAsiaTheme="minorEastAsia" w:hAnsi="Times New Roman" w:cs="Times New Roman"/>
-        </w:rPr>
-        <w:t xml:space="preserve">для любых частиц при максимальном магнитном поле в поворотных магнитах. Тем самым, определяется максимально возможная энергия для протонов </w:t>
+        <w:t xml:space="preserve">. Тем самым, определяется максимально возможная энергия для протонов </w:t>
       </w:r>
       <m:oMath>
         <m:sSubSup>
@@ -1074,7 +1101,13 @@
         <w:rPr>
           <w:rFonts w:ascii="Times New Roman" w:eastAsiaTheme="minorEastAsia" w:hAnsi="Times New Roman" w:cs="Times New Roman"/>
         </w:rPr>
-        <w:t xml:space="preserve"> (</w:t>
+        <w:t>,</w:t>
+      </w:r>
+      <w:r>
+        <w:rPr>
+          <w:rFonts w:ascii="Times New Roman" w:eastAsiaTheme="minorEastAsia" w:hAnsi="Times New Roman" w:cs="Times New Roman"/>
+        </w:rPr>
+        <w:t xml:space="preserve"> следовательно критическая энергия должна быть </w:t>
       </w:r>
       <m:oMath>
         <m:sSubSup>
@@ -1114,8 +1147,9 @@
             <m:r>
               <w:rPr>
                 <w:rFonts w:ascii="Cambria Math" w:hAnsi="Cambria Math" w:cs="Times New Roman"/>
-              </w:rPr>
-              <m:t>Au-Au</m:t>
+                <w:lang w:val="en-US"/>
+              </w:rPr>
+              <m:t>p</m:t>
             </m:r>
           </m:sup>
         </m:sSubSup>
@@ -1123,20 +1157,38 @@
           <w:rPr>
             <w:rFonts w:ascii="Cambria Math" w:hAnsi="Cambria Math" w:cs="Times New Roman"/>
           </w:rPr>
-          <m:t>=14,3</m:t>
+          <m:t>&gt;</m:t>
+        </m:r>
+        <m:r>
+          <w:rPr>
+            <w:rFonts w:ascii="Cambria Math" w:hAnsi="Cambria Math" w:cs="Times New Roman"/>
+          </w:rPr>
+          <m:t>1</m:t>
+        </m:r>
+        <m:r>
+          <w:rPr>
+            <w:rFonts w:ascii="Cambria Math" w:hAnsi="Cambria Math" w:cs="Times New Roman"/>
+          </w:rPr>
+          <m:t>5-16</m:t>
         </m:r>
       </m:oMath>
       <w:r>
         <w:rPr>
           <w:rFonts w:ascii="Times New Roman" w:eastAsiaTheme="minorEastAsia" w:hAnsi="Times New Roman" w:cs="Times New Roman"/>
         </w:rPr>
-        <w:t>)</w:t>
-      </w:r>
-      <w:r>
-        <w:rPr>
-          <w:rFonts w:ascii="Times New Roman" w:eastAsiaTheme="minorEastAsia" w:hAnsi="Times New Roman" w:cs="Times New Roman"/>
-        </w:rPr>
-        <w:t xml:space="preserve">, что заведомо выше критической энергии для ионной регулярной структуры </w:t>
+        <w:t xml:space="preserve">, </w:t>
+      </w:r>
+      <w:r>
+        <w:rPr>
+          <w:rFonts w:ascii="Times New Roman" w:eastAsiaTheme="minorEastAsia" w:hAnsi="Times New Roman" w:cs="Times New Roman"/>
+        </w:rPr>
+        <w:t xml:space="preserve">что </w:t>
+      </w:r>
+      <w:r>
+        <w:rPr>
+          <w:rFonts w:ascii="Times New Roman" w:eastAsiaTheme="minorEastAsia" w:hAnsi="Times New Roman" w:cs="Times New Roman"/>
+        </w:rPr>
+        <w:t xml:space="preserve">заведомо выше критической энергии для ионной регулярной структуры </w:t>
       </w:r>
       <m:oMath>
         <m:sSubSup>
@@ -1262,6 +1314,19 @@
         </w:rPr>
         <w:t xml:space="preserve">). </w:t>
       </w:r>
+      <w:r>
+        <w:rPr>
+          <w:rFonts w:ascii="Times New Roman" w:eastAsiaTheme="minorEastAsia" w:hAnsi="Times New Roman" w:cs="Times New Roman"/>
+        </w:rPr>
+        <w:t xml:space="preserve"> </w:t>
+      </w:r>
+    </w:p>
+    <w:p>
+      <w:pPr>
+        <w:rPr>
+          <w:rFonts w:ascii="Times New Roman" w:hAnsi="Times New Roman" w:cs="Times New Roman"/>
+        </w:rPr>
+      </w:pPr>
       <w:r>
         <w:rPr>
           <w:rFonts w:ascii="Times New Roman" w:eastAsiaTheme="minorEastAsia" w:hAnsi="Times New Roman" w:cs="Times New Roman"/>
@@ -1617,31 +1682,12 @@
               </m:r>
             </m:num>
             <m:den>
-              <m:sSub>
-                <m:sSubPr>
-                  <m:ctrlPr>
-                    <w:rPr>
-                      <w:rFonts w:ascii="Cambria Math" w:hAnsi="Cambria Math" w:cs="Times New Roman"/>
-                    </w:rPr>
-                  </m:ctrlPr>
-                </m:sSubPr>
-                <m:e>
-                  <m:r>
-                    <w:rPr>
-                      <w:rFonts w:ascii="Cambria Math" w:hAnsi="Cambria Math" w:cs="Times New Roman"/>
-                    </w:rPr>
-                    <m:t>γ</m:t>
-                  </m:r>
-                </m:e>
-                <m:sub>
-                  <m:r>
-                    <w:rPr>
-                      <w:rFonts w:ascii="Cambria Math" w:hAnsi="Cambria Math" w:cs="Times New Roman"/>
-                    </w:rPr>
-                    <m:t>tr</m:t>
-                  </m:r>
-                </m:sub>
-              </m:sSub>
+              <m:r>
+                <w:rPr>
+                  <w:rFonts w:ascii="Cambria Math" w:hAnsi="Cambria Math" w:cs="Times New Roman"/>
+                </w:rPr>
+                <m:t>γ</m:t>
+              </m:r>
             </m:den>
           </m:f>
           <m:r>
@@ -2131,7 +2177,56 @@
           <w:rPr>
             <w:rFonts w:ascii="Cambria Math" w:hAnsi="Cambria Math" w:cs="Times New Roman"/>
           </w:rPr>
-          <m:t>=0</m:t>
+          <m:t>=</m:t>
+        </m:r>
+        <m:f>
+          <m:fPr>
+            <m:ctrlPr>
+              <w:rPr>
+                <w:rFonts w:ascii="Cambria Math" w:hAnsi="Cambria Math" w:cs="Times New Roman"/>
+              </w:rPr>
+            </m:ctrlPr>
+          </m:fPr>
+          <m:num>
+            <m:r>
+              <w:rPr>
+                <w:rFonts w:ascii="Cambria Math" w:hAnsi="Cambria Math" w:cs="Times New Roman"/>
+              </w:rPr>
+              <m:t>1</m:t>
+            </m:r>
+          </m:num>
+          <m:den>
+            <m:r>
+              <w:rPr>
+                <w:rFonts w:ascii="Cambria Math" w:hAnsi="Cambria Math" w:cs="Times New Roman"/>
+              </w:rPr>
+              <m:t>ρ</m:t>
+            </m:r>
+            <m:d>
+              <m:dPr>
+                <m:ctrlPr>
+                  <w:rPr>
+                    <w:rFonts w:ascii="Cambria Math" w:hAnsi="Cambria Math" w:cs="Times New Roman"/>
+                    <w:i/>
+                  </w:rPr>
+                </m:ctrlPr>
+              </m:dPr>
+              <m:e>
+                <m:r>
+                  <w:rPr>
+                    <w:rFonts w:ascii="Cambria Math" w:hAnsi="Cambria Math" w:cs="Times New Roman"/>
+                  </w:rPr>
+                  <m:t>s</m:t>
+                </m:r>
+              </m:e>
+            </m:d>
+          </m:den>
+        </m:f>
+        <m:r>
+          <w:rPr>
+            <w:rFonts w:ascii="Cambria Math" w:hAnsi="Cambria Math" w:cs="Times New Roman"/>
+          </w:rPr>
+          <m:t xml:space="preserve"> </m:t>
         </m:r>
       </m:oMath>
       <w:r>
@@ -2450,16 +2545,8 @@
         <w:rPr>
           <w:rFonts w:ascii="Times New Roman" w:eastAsiaTheme="minorEastAsia" w:hAnsi="Times New Roman" w:cs="Times New Roman"/>
         </w:rPr>
-        <w:t xml:space="preserve"> </w:t>
-      </w:r>
-      <w:proofErr w:type="spellStart"/>
-      <w:r>
-        <w:rPr>
-          <w:rFonts w:ascii="Times New Roman" w:eastAsiaTheme="minorEastAsia" w:hAnsi="Times New Roman" w:cs="Times New Roman"/>
-        </w:rPr>
-        <w:t>суперпериодическая</w:t>
-      </w:r>
-      <w:proofErr w:type="spellEnd"/>
+        <w:t xml:space="preserve"> суперпериодическая</w:t>
+      </w:r>
       <w:r>
         <w:rPr>
           <w:rFonts w:ascii="Times New Roman" w:eastAsiaTheme="minorEastAsia" w:hAnsi="Times New Roman" w:cs="Times New Roman"/>
@@ -2675,16 +2762,8 @@
         <w:rPr>
           <w:rFonts w:ascii="Times New Roman" w:hAnsi="Times New Roman" w:cs="Times New Roman"/>
         </w:rPr>
-        <w:t xml:space="preserve">Поэтому мы используем только модуляцию силы квадрупольных линз по длине </w:t>
-      </w:r>
-      <w:proofErr w:type="spellStart"/>
-      <w:r>
-        <w:rPr>
-          <w:rFonts w:ascii="Times New Roman" w:hAnsi="Times New Roman" w:cs="Times New Roman"/>
-        </w:rPr>
-        <w:t>суперпериода</w:t>
-      </w:r>
-      <w:proofErr w:type="spellEnd"/>
+        <w:t>Поэтому мы используем только модуляцию силы квадрупольных линз по длине суперпериода</w:t>
+      </w:r>
       <w:r>
         <w:rPr>
           <w:rFonts w:ascii="Times New Roman" w:hAnsi="Times New Roman" w:cs="Times New Roman"/>
@@ -2788,41 +2867,13 @@
         <w:rPr>
           <w:rFonts w:ascii="Times New Roman" w:eastAsiaTheme="minorEastAsia" w:hAnsi="Times New Roman" w:cs="Times New Roman"/>
         </w:rPr>
-        <w:t xml:space="preserve">имеет периодичность </w:t>
-      </w:r>
-      <w:proofErr w:type="spellStart"/>
-      <w:r>
-        <w:rPr>
-          <w:rFonts w:ascii="Times New Roman" w:eastAsiaTheme="minorEastAsia" w:hAnsi="Times New Roman" w:cs="Times New Roman"/>
-        </w:rPr>
-        <w:t>суперпериода</w:t>
-      </w:r>
-      <w:proofErr w:type="spellEnd"/>
-      <w:r>
-        <w:rPr>
-          <w:rFonts w:ascii="Times New Roman" w:eastAsiaTheme="minorEastAsia" w:hAnsi="Times New Roman" w:cs="Times New Roman"/>
-        </w:rPr>
-        <w:t>.</w:t>
-      </w:r>
-      <w:r>
-        <w:rPr>
-          <w:rFonts w:ascii="Times New Roman" w:eastAsiaTheme="minorEastAsia" w:hAnsi="Times New Roman" w:cs="Times New Roman"/>
-        </w:rPr>
-        <w:t xml:space="preserve"> Для одного </w:t>
-      </w:r>
-      <w:proofErr w:type="spellStart"/>
-      <w:r>
-        <w:rPr>
-          <w:rFonts w:ascii="Times New Roman" w:eastAsiaTheme="minorEastAsia" w:hAnsi="Times New Roman" w:cs="Times New Roman"/>
-        </w:rPr>
-        <w:t>суперпериода</w:t>
-      </w:r>
-      <w:proofErr w:type="spellEnd"/>
-      <w:r>
-        <w:rPr>
-          <w:rFonts w:ascii="Times New Roman" w:eastAsiaTheme="minorEastAsia" w:hAnsi="Times New Roman" w:cs="Times New Roman"/>
-        </w:rPr>
-        <w:t xml:space="preserve"> </w:t>
+        <w:t>имеет периодичность суперпериода.</w:t>
+      </w:r>
+      <w:r>
+        <w:rPr>
+          <w:rFonts w:ascii="Times New Roman" w:eastAsiaTheme="minorEastAsia" w:hAnsi="Times New Roman" w:cs="Times New Roman"/>
+        </w:rPr>
+        <w:t xml:space="preserve"> Для одного суперпериода </w:t>
       </w:r>
       <w:r>
         <w:rPr>
@@ -3476,50 +3527,74 @@
         <w:rPr>
           <w:rFonts w:ascii="Times New Roman" w:eastAsiaTheme="minorEastAsia" w:hAnsi="Times New Roman" w:cs="Times New Roman"/>
         </w:rPr>
+        <w:t xml:space="preserve"> –</w:t>
+      </w:r>
+      <w:r>
+        <w:rPr>
+          <w:rFonts w:ascii="Times New Roman" w:eastAsiaTheme="minorEastAsia" w:hAnsi="Times New Roman" w:cs="Times New Roman"/>
+        </w:rPr>
+        <w:t xml:space="preserve"> число </w:t>
+      </w:r>
+      <w:r>
+        <w:rPr>
+          <w:rFonts w:ascii="Times New Roman" w:eastAsiaTheme="minorEastAsia" w:hAnsi="Times New Roman" w:cs="Times New Roman"/>
+        </w:rPr>
+        <w:t>бетатронных колебаний</w:t>
+      </w:r>
+      <w:r>
+        <w:rPr>
+          <w:rFonts w:ascii="Times New Roman" w:eastAsiaTheme="minorEastAsia" w:hAnsi="Times New Roman" w:cs="Times New Roman"/>
+        </w:rPr>
+        <w:t xml:space="preserve"> </w:t>
+      </w:r>
+      <w:r>
+        <w:rPr>
+          <w:rFonts w:ascii="Times New Roman" w:eastAsiaTheme="minorEastAsia" w:hAnsi="Times New Roman" w:cs="Times New Roman"/>
+        </w:rPr>
+        <w:t>на</w:t>
+      </w:r>
+      <w:r>
+        <w:rPr>
+          <w:rFonts w:ascii="Times New Roman" w:eastAsiaTheme="minorEastAsia" w:hAnsi="Times New Roman" w:cs="Times New Roman"/>
+        </w:rPr>
+        <w:t xml:space="preserve"> длине </w:t>
+      </w:r>
+      <w:r>
+        <w:rPr>
+          <w:rFonts w:ascii="Times New Roman" w:eastAsiaTheme="minorEastAsia" w:hAnsi="Times New Roman" w:cs="Times New Roman"/>
+        </w:rPr>
+        <w:t>арке</w:t>
+      </w:r>
+      <w:r>
+        <w:rPr>
+          <w:rFonts w:ascii="Times New Roman" w:eastAsiaTheme="minorEastAsia" w:hAnsi="Times New Roman" w:cs="Times New Roman"/>
+        </w:rPr>
+        <w:t xml:space="preserve">, </w:t>
+      </w:r>
+      <w:r>
+        <w:rPr>
+          <w:rFonts w:ascii="Times New Roman" w:eastAsiaTheme="minorEastAsia" w:hAnsi="Times New Roman" w:cs="Times New Roman"/>
+          <w:lang w:val="en-US"/>
+        </w:rPr>
+        <w:t>S</w:t>
+      </w:r>
+      <w:r>
+        <w:rPr>
+          <w:rFonts w:ascii="Times New Roman" w:eastAsiaTheme="minorEastAsia" w:hAnsi="Times New Roman" w:cs="Times New Roman"/>
+        </w:rPr>
         <w:t xml:space="preserve"> – </w:t>
       </w:r>
       <w:r>
         <w:rPr>
           <w:rFonts w:ascii="Times New Roman" w:eastAsiaTheme="minorEastAsia" w:hAnsi="Times New Roman" w:cs="Times New Roman"/>
         </w:rPr>
-        <w:t>частота горизонтальных бетатронных колебаний</w:t>
-      </w:r>
-      <w:r>
-        <w:rPr>
-          <w:rFonts w:ascii="Times New Roman" w:eastAsiaTheme="minorEastAsia" w:hAnsi="Times New Roman" w:cs="Times New Roman"/>
-        </w:rPr>
-        <w:t xml:space="preserve"> </w:t>
-      </w:r>
-      <w:r>
-        <w:rPr>
-          <w:rFonts w:ascii="Times New Roman" w:eastAsiaTheme="minorEastAsia" w:hAnsi="Times New Roman" w:cs="Times New Roman"/>
-        </w:rPr>
-        <w:t>на арке</w:t>
-      </w:r>
-      <w:r>
-        <w:rPr>
-          <w:rFonts w:ascii="Times New Roman" w:eastAsiaTheme="minorEastAsia" w:hAnsi="Times New Roman" w:cs="Times New Roman"/>
-        </w:rPr>
-        <w:t xml:space="preserve">, </w:t>
-      </w:r>
-      <w:r>
-        <w:rPr>
-          <w:rFonts w:ascii="Times New Roman" w:eastAsiaTheme="minorEastAsia" w:hAnsi="Times New Roman" w:cs="Times New Roman"/>
-          <w:lang w:val="en-US"/>
-        </w:rPr>
-        <w:t>S</w:t>
-      </w:r>
-      <w:r>
-        <w:rPr>
-          <w:rFonts w:ascii="Times New Roman" w:eastAsiaTheme="minorEastAsia" w:hAnsi="Times New Roman" w:cs="Times New Roman"/>
-        </w:rPr>
-        <w:t xml:space="preserve"> – </w:t>
-      </w:r>
-      <w:r>
-        <w:rPr>
-          <w:rFonts w:ascii="Times New Roman" w:eastAsiaTheme="minorEastAsia" w:hAnsi="Times New Roman" w:cs="Times New Roman"/>
-        </w:rPr>
         <w:t>количество суперпериодов</w:t>
+      </w:r>
+      <w:r>
+        <w:rPr>
+          <w:rFonts w:ascii="Times New Roman" w:eastAsiaTheme="minorEastAsia" w:hAnsi="Times New Roman" w:cs="Times New Roman"/>
+        </w:rPr>
+        <w:t xml:space="preserve"> на одной арке</w:t>
       </w:r>
       <w:r>
         <w:rPr>
@@ -4683,25 +4758,7 @@
           <w:b/>
           <w:bCs/>
         </w:rPr>
-        <w:t xml:space="preserve">Введение </w:t>
-      </w:r>
-      <w:proofErr w:type="spellStart"/>
-      <w:r>
-        <w:rPr>
-          <w:rFonts w:ascii="Times New Roman" w:hAnsi="Times New Roman" w:cs="Times New Roman"/>
-          <w:b/>
-          <w:bCs/>
-        </w:rPr>
-        <w:t>суперпериодичности</w:t>
-      </w:r>
-      <w:proofErr w:type="spellEnd"/>
-      <w:r>
-        <w:rPr>
-          <w:rFonts w:ascii="Times New Roman" w:hAnsi="Times New Roman" w:cs="Times New Roman"/>
-          <w:b/>
-          <w:bCs/>
-        </w:rPr>
-        <w:t xml:space="preserve"> на арках</w:t>
+        <w:t>Введение суперпериодичности на арках</w:t>
       </w:r>
       <w:r>
         <w:rPr>
@@ -4733,53 +4790,59 @@
         <w:rPr>
           <w:rFonts w:ascii="Times New Roman" w:hAnsi="Times New Roman" w:cs="Times New Roman"/>
         </w:rPr>
+        <w:t xml:space="preserve">Одинаковые элементы объединяют в одно семейство. </w:t>
+      </w:r>
+      <w:r>
+        <w:rPr>
+          <w:rFonts w:ascii="Times New Roman" w:hAnsi="Times New Roman" w:cs="Times New Roman"/>
+        </w:rPr>
+        <w:t xml:space="preserve">Один </w:t>
+      </w:r>
+      <w:proofErr w:type="spellStart"/>
+      <w:r>
+        <w:rPr>
+          <w:rFonts w:ascii="Times New Roman" w:hAnsi="Times New Roman" w:cs="Times New Roman"/>
+        </w:rPr>
+        <w:t>суперпериод</w:t>
+      </w:r>
+      <w:proofErr w:type="spellEnd"/>
+      <w:r>
+        <w:rPr>
+          <w:rFonts w:ascii="Times New Roman" w:hAnsi="Times New Roman" w:cs="Times New Roman"/>
+        </w:rPr>
+        <w:t xml:space="preserve"> состоит из 3-х ФОДО ячеек</w:t>
+      </w:r>
+      <w:r>
+        <w:rPr>
+          <w:rFonts w:ascii="Times New Roman" w:hAnsi="Times New Roman" w:cs="Times New Roman"/>
+        </w:rPr>
+        <w:t xml:space="preserve">, </w:t>
+      </w:r>
+      <w:r>
+        <w:rPr>
+          <w:rFonts w:ascii="Times New Roman" w:hAnsi="Times New Roman" w:cs="Times New Roman"/>
+          <w:lang w:val="en-US"/>
+        </w:rPr>
+        <w:t>c</w:t>
+      </w:r>
+      <w:r>
+        <w:rPr>
+          <w:rFonts w:ascii="Times New Roman" w:hAnsi="Times New Roman" w:cs="Times New Roman"/>
+        </w:rPr>
+        <w:t xml:space="preserve"> </w:t>
+      </w:r>
+      <w:r>
+        <w:rPr>
+          <w:rFonts w:ascii="Times New Roman" w:hAnsi="Times New Roman" w:cs="Times New Roman"/>
+        </w:rPr>
+        <w:t xml:space="preserve">двумя семействами фокусирующих квадруполей и одним семейством </w:t>
+      </w:r>
+      <w:proofErr w:type="spellStart"/>
+      <w:r>
+        <w:rPr>
+          <w:rFonts w:ascii="Times New Roman" w:hAnsi="Times New Roman" w:cs="Times New Roman"/>
+        </w:rPr>
         <w:lastRenderedPageBreak/>
-        <w:t xml:space="preserve">Один </w:t>
-      </w:r>
-      <w:proofErr w:type="spellStart"/>
-      <w:r>
-        <w:rPr>
-          <w:rFonts w:ascii="Times New Roman" w:hAnsi="Times New Roman" w:cs="Times New Roman"/>
-        </w:rPr>
-        <w:t>суперпериод</w:t>
-      </w:r>
-      <w:proofErr w:type="spellEnd"/>
-      <w:r>
-        <w:rPr>
-          <w:rFonts w:ascii="Times New Roman" w:hAnsi="Times New Roman" w:cs="Times New Roman"/>
-        </w:rPr>
-        <w:t xml:space="preserve"> состоит из 3-х ФОДО ячеек</w:t>
-      </w:r>
-      <w:r>
-        <w:rPr>
-          <w:rFonts w:ascii="Times New Roman" w:hAnsi="Times New Roman" w:cs="Times New Roman"/>
-        </w:rPr>
-        <w:t xml:space="preserve">, </w:t>
-      </w:r>
-      <w:r>
-        <w:rPr>
-          <w:rFonts w:ascii="Times New Roman" w:hAnsi="Times New Roman" w:cs="Times New Roman"/>
-          <w:lang w:val="en-US"/>
-        </w:rPr>
-        <w:t>c</w:t>
-      </w:r>
-      <w:r>
-        <w:rPr>
-          <w:rFonts w:ascii="Times New Roman" w:hAnsi="Times New Roman" w:cs="Times New Roman"/>
-        </w:rPr>
-        <w:t xml:space="preserve"> </w:t>
-      </w:r>
-      <w:r>
-        <w:rPr>
-          <w:rFonts w:ascii="Times New Roman" w:hAnsi="Times New Roman" w:cs="Times New Roman"/>
-        </w:rPr>
-        <w:t xml:space="preserve">двумя семействами фокусирующих квадруполей и одним семейством </w:t>
-      </w:r>
-      <w:proofErr w:type="spellStart"/>
-      <w:r>
-        <w:rPr>
-          <w:rFonts w:ascii="Times New Roman" w:hAnsi="Times New Roman" w:cs="Times New Roman"/>
-        </w:rPr>
         <w:t>дефокусирующих</w:t>
       </w:r>
       <w:proofErr w:type="spellEnd"/>
@@ -5106,6 +5169,15 @@
         <w:rPr>
           <w:rFonts w:ascii="Times New Roman" w:eastAsiaTheme="minorEastAsia" w:hAnsi="Times New Roman" w:cs="Times New Roman"/>
           <w:iCs/>
+        </w:rPr>
+      </w:pPr>
+    </w:p>
+    <w:p>
+      <w:pPr>
+        <w:rPr>
+          <w:rFonts w:ascii="Times New Roman" w:eastAsiaTheme="minorEastAsia" w:hAnsi="Times New Roman" w:cs="Times New Roman"/>
+          <w:iCs/>
+          <w:lang w:val="en-US"/>
         </w:rPr>
         <w:sectPr>
           <w:type w:val="continuous"/>
@@ -5364,7 +5436,165 @@
           <w:rFonts w:ascii="Times New Roman" w:eastAsiaTheme="minorEastAsia" w:hAnsi="Times New Roman" w:cs="Times New Roman"/>
           <w:iCs/>
         </w:rPr>
-        <w:t xml:space="preserve">введением </w:t>
+        <w:t>введением суперпериодичности</w:t>
+      </w:r>
+      <w:r>
+        <w:rPr>
+          <w:rFonts w:ascii="Times New Roman" w:eastAsiaTheme="minorEastAsia" w:hAnsi="Times New Roman" w:cs="Times New Roman"/>
+          <w:iCs/>
+        </w:rPr>
+        <w:t xml:space="preserve">, </w:t>
+      </w:r>
+      <w:r>
+        <w:rPr>
+          <w:rFonts w:ascii="Times New Roman" w:eastAsiaTheme="minorEastAsia" w:hAnsi="Times New Roman" w:cs="Times New Roman"/>
+          <w:iCs/>
+        </w:rPr>
+        <w:t>глубина модуляции</w:t>
+      </w:r>
+      <w:r>
+        <w:rPr>
+          <w:rFonts w:ascii="Times New Roman" w:eastAsiaTheme="minorEastAsia" w:hAnsi="Times New Roman" w:cs="Times New Roman"/>
+          <w:iCs/>
+        </w:rPr>
+        <w:t xml:space="preserve"> </w:t>
+      </w:r>
+      <w:r>
+        <w:rPr>
+          <w:rFonts w:ascii="Times New Roman" w:eastAsiaTheme="minorEastAsia" w:hAnsi="Times New Roman" w:cs="Times New Roman"/>
+          <w:iCs/>
+        </w:rPr>
+        <w:t>2</w:t>
+      </w:r>
+      <w:r>
+        <w:rPr>
+          <w:rFonts w:ascii="Times New Roman" w:eastAsiaTheme="minorEastAsia" w:hAnsi="Times New Roman" w:cs="Times New Roman"/>
+          <w:iCs/>
+        </w:rPr>
+        <w:t>4</w:t>
+      </w:r>
+      <w:r>
+        <w:rPr>
+          <w:rFonts w:ascii="Times New Roman" w:eastAsiaTheme="minorEastAsia" w:hAnsi="Times New Roman" w:cs="Times New Roman"/>
+          <w:iCs/>
+        </w:rPr>
+        <w:t>%</w:t>
+      </w:r>
+      <w:r>
+        <w:rPr>
+          <w:rFonts w:ascii="Times New Roman" w:eastAsiaTheme="minorEastAsia" w:hAnsi="Times New Roman" w:cs="Times New Roman"/>
+          <w:iCs/>
+        </w:rPr>
+        <w:t>.</w:t>
+      </w:r>
+    </w:p>
+    <w:p>
+      <w:pPr>
+        <w:rPr>
+          <w:rFonts w:ascii="Times New Roman" w:eastAsiaTheme="minorEastAsia" w:hAnsi="Times New Roman" w:cs="Times New Roman"/>
+          <w:iCs/>
+        </w:rPr>
+      </w:pPr>
+    </w:p>
+    <w:p>
+      <w:pPr>
+        <w:rPr>
+          <w:rFonts w:ascii="Times New Roman" w:eastAsiaTheme="minorEastAsia" w:hAnsi="Times New Roman" w:cs="Times New Roman"/>
+          <w:iCs/>
+        </w:rPr>
+      </w:pPr>
+      <w:r>
+        <w:rPr>
+          <w:rFonts w:ascii="Times New Roman" w:eastAsiaTheme="minorEastAsia" w:hAnsi="Times New Roman" w:cs="Times New Roman"/>
+          <w:iCs/>
+        </w:rPr>
+        <w:t>На рис</w:t>
+      </w:r>
+      <w:r>
+        <w:rPr>
+          <w:rFonts w:ascii="Times New Roman" w:eastAsiaTheme="minorEastAsia" w:hAnsi="Times New Roman" w:cs="Times New Roman"/>
+          <w:iCs/>
+        </w:rPr>
+        <w:t xml:space="preserve">.2 </w:t>
+      </w:r>
+      <w:r>
+        <w:rPr>
+          <w:rFonts w:ascii="Times New Roman" w:eastAsiaTheme="minorEastAsia" w:hAnsi="Times New Roman" w:cs="Times New Roman"/>
+          <w:iCs/>
+        </w:rPr>
+        <w:t>приведены 3 ФОДО ячейки</w:t>
+      </w:r>
+      <w:r>
+        <w:rPr>
+          <w:rFonts w:ascii="Times New Roman" w:eastAsiaTheme="minorEastAsia" w:hAnsi="Times New Roman" w:cs="Times New Roman"/>
+          <w:iCs/>
+        </w:rPr>
+        <w:t xml:space="preserve">, </w:t>
+      </w:r>
+      <w:r>
+        <w:rPr>
+          <w:rFonts w:ascii="Times New Roman" w:eastAsiaTheme="minorEastAsia" w:hAnsi="Times New Roman" w:cs="Times New Roman"/>
+          <w:iCs/>
+        </w:rPr>
+        <w:t>первая – используется в регулярной тяжелоионной структуре</w:t>
+      </w:r>
+      <w:r>
+        <w:rPr>
+          <w:rFonts w:ascii="Times New Roman" w:eastAsiaTheme="minorEastAsia" w:hAnsi="Times New Roman" w:cs="Times New Roman"/>
+          <w:iCs/>
+        </w:rPr>
+        <w:t xml:space="preserve">, </w:t>
+      </w:r>
+      <w:r>
+        <w:rPr>
+          <w:rFonts w:ascii="Times New Roman" w:eastAsiaTheme="minorEastAsia" w:hAnsi="Times New Roman" w:cs="Times New Roman"/>
+          <w:iCs/>
+        </w:rPr>
+        <w:t>в этом случае модуляция отсутствует</w:t>
+      </w:r>
+      <w:r>
+        <w:rPr>
+          <w:rFonts w:ascii="Times New Roman" w:eastAsiaTheme="minorEastAsia" w:hAnsi="Times New Roman" w:cs="Times New Roman"/>
+          <w:iCs/>
+        </w:rPr>
+        <w:t xml:space="preserve">, </w:t>
+      </w:r>
+      <w:r>
+        <w:rPr>
+          <w:rFonts w:ascii="Times New Roman" w:eastAsiaTheme="minorEastAsia" w:hAnsi="Times New Roman" w:cs="Times New Roman"/>
+          <w:iCs/>
+        </w:rPr>
+        <w:t xml:space="preserve">вторая – модулированная </w:t>
+      </w:r>
+      <w:proofErr w:type="gramStart"/>
+      <w:r>
+        <w:rPr>
+          <w:rFonts w:ascii="Times New Roman" w:eastAsiaTheme="minorEastAsia" w:hAnsi="Times New Roman" w:cs="Times New Roman"/>
+          <w:iCs/>
+        </w:rPr>
+        <w:t>структура</w:t>
+      </w:r>
+      <w:r>
+        <w:rPr>
+          <w:rFonts w:ascii="Times New Roman" w:eastAsiaTheme="minorEastAsia" w:hAnsi="Times New Roman" w:cs="Times New Roman"/>
+          <w:iCs/>
+        </w:rPr>
+        <w:t xml:space="preserve">,  </w:t>
+      </w:r>
+      <w:r>
+        <w:rPr>
+          <w:rFonts w:ascii="Times New Roman" w:eastAsiaTheme="minorEastAsia" w:hAnsi="Times New Roman" w:cs="Times New Roman"/>
+          <w:iCs/>
+        </w:rPr>
+        <w:t>которая</w:t>
+      </w:r>
+      <w:proofErr w:type="gramEnd"/>
+      <w:r>
+        <w:rPr>
+          <w:rFonts w:ascii="Times New Roman" w:eastAsiaTheme="minorEastAsia" w:hAnsi="Times New Roman" w:cs="Times New Roman"/>
+          <w:iCs/>
+        </w:rPr>
+        <w:t xml:space="preserve"> и образует один </w:t>
       </w:r>
       <w:proofErr w:type="spellStart"/>
       <w:r>
@@ -5372,7 +5602,7 @@
           <w:rFonts w:ascii="Times New Roman" w:eastAsiaTheme="minorEastAsia" w:hAnsi="Times New Roman" w:cs="Times New Roman"/>
           <w:iCs/>
         </w:rPr>
-        <w:t>суперпериодичности</w:t>
+        <w:t>суперпериод</w:t>
       </w:r>
       <w:proofErr w:type="spellEnd"/>
       <w:r>
@@ -5380,173 +5610,6 @@
           <w:rFonts w:ascii="Times New Roman" w:eastAsiaTheme="minorEastAsia" w:hAnsi="Times New Roman" w:cs="Times New Roman"/>
           <w:iCs/>
         </w:rPr>
-        <w:t xml:space="preserve">, </w:t>
-      </w:r>
-      <w:r>
-        <w:rPr>
-          <w:rFonts w:ascii="Times New Roman" w:eastAsiaTheme="minorEastAsia" w:hAnsi="Times New Roman" w:cs="Times New Roman"/>
-          <w:iCs/>
-        </w:rPr>
-        <w:t>глубина модуляции</w:t>
-      </w:r>
-      <w:r>
-        <w:rPr>
-          <w:rFonts w:ascii="Times New Roman" w:eastAsiaTheme="minorEastAsia" w:hAnsi="Times New Roman" w:cs="Times New Roman"/>
-          <w:iCs/>
-        </w:rPr>
-        <w:t xml:space="preserve"> </w:t>
-      </w:r>
-      <w:r>
-        <w:rPr>
-          <w:rFonts w:ascii="Times New Roman" w:eastAsiaTheme="minorEastAsia" w:hAnsi="Times New Roman" w:cs="Times New Roman"/>
-          <w:iCs/>
-        </w:rPr>
-        <w:t>2</w:t>
-      </w:r>
-      <w:r>
-        <w:rPr>
-          <w:rFonts w:ascii="Times New Roman" w:eastAsiaTheme="minorEastAsia" w:hAnsi="Times New Roman" w:cs="Times New Roman"/>
-          <w:iCs/>
-        </w:rPr>
-        <w:t>4</w:t>
-      </w:r>
-      <w:r>
-        <w:rPr>
-          <w:rFonts w:ascii="Times New Roman" w:eastAsiaTheme="minorEastAsia" w:hAnsi="Times New Roman" w:cs="Times New Roman"/>
-          <w:iCs/>
-        </w:rPr>
-        <w:t>%</w:t>
-      </w:r>
-      <w:r>
-        <w:rPr>
-          <w:rFonts w:ascii="Times New Roman" w:eastAsiaTheme="minorEastAsia" w:hAnsi="Times New Roman" w:cs="Times New Roman"/>
-          <w:iCs/>
-        </w:rPr>
-        <w:t>.</w:t>
-      </w:r>
-    </w:p>
-    <w:p>
-      <w:pPr>
-        <w:rPr>
-          <w:rFonts w:ascii="Times New Roman" w:eastAsiaTheme="minorEastAsia" w:hAnsi="Times New Roman" w:cs="Times New Roman"/>
-          <w:iCs/>
-        </w:rPr>
-      </w:pPr>
-    </w:p>
-    <w:p>
-      <w:pPr>
-        <w:rPr>
-          <w:rFonts w:ascii="Times New Roman" w:eastAsiaTheme="minorEastAsia" w:hAnsi="Times New Roman" w:cs="Times New Roman"/>
-          <w:iCs/>
-        </w:rPr>
-      </w:pPr>
-      <w:r>
-        <w:rPr>
-          <w:rFonts w:ascii="Times New Roman" w:eastAsiaTheme="minorEastAsia" w:hAnsi="Times New Roman" w:cs="Times New Roman"/>
-          <w:iCs/>
-        </w:rPr>
-        <w:t>На рис</w:t>
-      </w:r>
-      <w:r>
-        <w:rPr>
-          <w:rFonts w:ascii="Times New Roman" w:eastAsiaTheme="minorEastAsia" w:hAnsi="Times New Roman" w:cs="Times New Roman"/>
-          <w:iCs/>
-        </w:rPr>
-        <w:t xml:space="preserve">.2 </w:t>
-      </w:r>
-      <w:r>
-        <w:rPr>
-          <w:rFonts w:ascii="Times New Roman" w:eastAsiaTheme="minorEastAsia" w:hAnsi="Times New Roman" w:cs="Times New Roman"/>
-          <w:iCs/>
-        </w:rPr>
-        <w:t>приведены 3 ФОДО ячейки</w:t>
-      </w:r>
-      <w:r>
-        <w:rPr>
-          <w:rFonts w:ascii="Times New Roman" w:eastAsiaTheme="minorEastAsia" w:hAnsi="Times New Roman" w:cs="Times New Roman"/>
-          <w:iCs/>
-        </w:rPr>
-        <w:t xml:space="preserve">, </w:t>
-      </w:r>
-      <w:r>
-        <w:rPr>
-          <w:rFonts w:ascii="Times New Roman" w:eastAsiaTheme="minorEastAsia" w:hAnsi="Times New Roman" w:cs="Times New Roman"/>
-          <w:iCs/>
-        </w:rPr>
-        <w:t>первая – используется в регулярной тяжелоионной структуре</w:t>
-      </w:r>
-      <w:r>
-        <w:rPr>
-          <w:rFonts w:ascii="Times New Roman" w:eastAsiaTheme="minorEastAsia" w:hAnsi="Times New Roman" w:cs="Times New Roman"/>
-          <w:iCs/>
-        </w:rPr>
-        <w:t xml:space="preserve">, </w:t>
-      </w:r>
-      <w:r>
-        <w:rPr>
-          <w:rFonts w:ascii="Times New Roman" w:eastAsiaTheme="minorEastAsia" w:hAnsi="Times New Roman" w:cs="Times New Roman"/>
-          <w:iCs/>
-        </w:rPr>
-        <w:t>в этом случае модуляция отсутствует</w:t>
-      </w:r>
-      <w:r>
-        <w:rPr>
-          <w:rFonts w:ascii="Times New Roman" w:eastAsiaTheme="minorEastAsia" w:hAnsi="Times New Roman" w:cs="Times New Roman"/>
-          <w:iCs/>
-        </w:rPr>
-        <w:t xml:space="preserve">, </w:t>
-      </w:r>
-      <w:r>
-        <w:rPr>
-          <w:rFonts w:ascii="Times New Roman" w:eastAsiaTheme="minorEastAsia" w:hAnsi="Times New Roman" w:cs="Times New Roman"/>
-          <w:iCs/>
-        </w:rPr>
-        <w:t xml:space="preserve">вторая – модулированная </w:t>
-      </w:r>
-      <w:proofErr w:type="gramStart"/>
-      <w:r>
-        <w:rPr>
-          <w:rFonts w:ascii="Times New Roman" w:eastAsiaTheme="minorEastAsia" w:hAnsi="Times New Roman" w:cs="Times New Roman"/>
-          <w:iCs/>
-        </w:rPr>
-        <w:t>структура</w:t>
-      </w:r>
-      <w:r>
-        <w:rPr>
-          <w:rFonts w:ascii="Times New Roman" w:eastAsiaTheme="minorEastAsia" w:hAnsi="Times New Roman" w:cs="Times New Roman"/>
-          <w:iCs/>
-        </w:rPr>
-        <w:t xml:space="preserve">,  </w:t>
-      </w:r>
-      <w:r>
-        <w:rPr>
-          <w:rFonts w:ascii="Times New Roman" w:eastAsiaTheme="minorEastAsia" w:hAnsi="Times New Roman" w:cs="Times New Roman"/>
-          <w:iCs/>
-        </w:rPr>
-        <w:t>которая</w:t>
-      </w:r>
-      <w:proofErr w:type="gramEnd"/>
-      <w:r>
-        <w:rPr>
-          <w:rFonts w:ascii="Times New Roman" w:eastAsiaTheme="minorEastAsia" w:hAnsi="Times New Roman" w:cs="Times New Roman"/>
-          <w:iCs/>
-        </w:rPr>
-        <w:t xml:space="preserve"> и образует один </w:t>
-      </w:r>
-      <w:proofErr w:type="spellStart"/>
-      <w:r>
-        <w:rPr>
-          <w:rFonts w:ascii="Times New Roman" w:eastAsiaTheme="minorEastAsia" w:hAnsi="Times New Roman" w:cs="Times New Roman"/>
-          <w:iCs/>
-        </w:rPr>
-        <w:t>суперпериод</w:t>
-      </w:r>
-      <w:proofErr w:type="spellEnd"/>
-      <w:r>
-        <w:rPr>
-          <w:rFonts w:ascii="Times New Roman" w:eastAsiaTheme="minorEastAsia" w:hAnsi="Times New Roman" w:cs="Times New Roman"/>
-          <w:iCs/>
-        </w:rPr>
         <w:t xml:space="preserve">. </w:t>
       </w:r>
       <w:r>
@@ -5554,16 +5617,29 @@
           <w:rFonts w:ascii="Times New Roman" w:eastAsiaTheme="minorEastAsia" w:hAnsi="Times New Roman" w:cs="Times New Roman"/>
           <w:iCs/>
         </w:rPr>
-        <w:t xml:space="preserve">В обоих случаях частота бетатронных колебаний </w:t>
-      </w:r>
-    </w:p>
-    <w:p>
-      <w:pPr>
-        <w:rPr>
-          <w:rFonts w:ascii="Times New Roman" w:eastAsiaTheme="minorEastAsia" w:hAnsi="Times New Roman" w:cs="Times New Roman"/>
-          <w:iCs/>
-        </w:rPr>
-      </w:pPr>
+        <w:t xml:space="preserve">В обоих случаях </w:t>
+      </w:r>
+      <w:r>
+        <w:rPr>
+          <w:rFonts w:ascii="Times New Roman" w:eastAsiaTheme="minorEastAsia" w:hAnsi="Times New Roman" w:cs="Times New Roman"/>
+          <w:iCs/>
+        </w:rPr>
+        <w:t xml:space="preserve">количество </w:t>
+      </w:r>
+      <w:r>
+        <w:rPr>
+          <w:rFonts w:ascii="Times New Roman" w:eastAsiaTheme="minorEastAsia" w:hAnsi="Times New Roman" w:cs="Times New Roman"/>
+          <w:iCs/>
+        </w:rPr>
+        <w:t xml:space="preserve">бетатронных колебаний </w:t>
+      </w:r>
+      <w:r>
+        <w:rPr>
+          <w:rFonts w:ascii="Times New Roman" w:eastAsiaTheme="minorEastAsia" w:hAnsi="Times New Roman" w:cs="Times New Roman"/>
+          <w:iCs/>
+        </w:rPr>
+        <w:t xml:space="preserve">на арке </w:t>
+      </w:r>
       <m:oMath>
         <m:sSub>
           <m:sSubPr>
@@ -5630,7 +5706,7 @@
           <w:rFonts w:ascii="Times New Roman" w:eastAsiaTheme="minorEastAsia" w:hAnsi="Times New Roman" w:cs="Times New Roman"/>
           <w:iCs/>
         </w:rPr>
-        <w:t xml:space="preserve">таким образом для 4-х суперпериодов частота </w:t>
+        <w:t xml:space="preserve">таким образом для 4-х суперпериодов </w:t>
       </w:r>
       <m:oMath>
         <m:sSub>
@@ -6012,7 +6088,42 @@
           <w:rFonts w:ascii="Times New Roman" w:eastAsiaTheme="minorEastAsia" w:hAnsi="Times New Roman" w:cs="Times New Roman"/>
           <w:iCs/>
         </w:rPr>
-        <w:t xml:space="preserve">Для регулярной арки из 4-х одинаковых суперпериодов </w:t>
+        <w:t>Для</w:t>
+      </w:r>
+      <w:r>
+        <w:rPr>
+          <w:rFonts w:ascii="Times New Roman" w:eastAsiaTheme="minorEastAsia" w:hAnsi="Times New Roman" w:cs="Times New Roman"/>
+          <w:iCs/>
+        </w:rPr>
+        <w:t xml:space="preserve"> </w:t>
+      </w:r>
+      <w:r>
+        <w:rPr>
+          <w:rFonts w:ascii="Times New Roman" w:eastAsiaTheme="minorEastAsia" w:hAnsi="Times New Roman" w:cs="Times New Roman"/>
+          <w:iCs/>
+        </w:rPr>
+        <w:t>арки</w:t>
+      </w:r>
+      <w:r>
+        <w:rPr>
+          <w:rFonts w:ascii="Times New Roman" w:eastAsiaTheme="minorEastAsia" w:hAnsi="Times New Roman" w:cs="Times New Roman"/>
+          <w:iCs/>
+        </w:rPr>
+        <w:t xml:space="preserve">, </w:t>
+      </w:r>
+      <w:r>
+        <w:rPr>
+          <w:rFonts w:ascii="Times New Roman" w:eastAsiaTheme="minorEastAsia" w:hAnsi="Times New Roman" w:cs="Times New Roman"/>
+          <w:iCs/>
+        </w:rPr>
+        <w:t>составленной</w:t>
+      </w:r>
+      <w:r>
+        <w:rPr>
+          <w:rFonts w:ascii="Times New Roman" w:eastAsiaTheme="minorEastAsia" w:hAnsi="Times New Roman" w:cs="Times New Roman"/>
+          <w:iCs/>
+        </w:rPr>
+        <w:t xml:space="preserve"> из 4-х одинаковых суперпериодов </w:t>
       </w:r>
       <w:r>
         <w:rPr>
@@ -6226,14 +6337,6 @@
           <w:iCs/>
         </w:rPr>
       </w:pPr>
-    </w:p>
-    <w:p>
-      <w:pPr>
-        <w:rPr>
-          <w:rFonts w:ascii="Times New Roman" w:eastAsiaTheme="minorEastAsia" w:hAnsi="Times New Roman" w:cs="Times New Roman"/>
-          <w:iCs/>
-        </w:rPr>
-      </w:pPr>
       <w:r>
         <w:rPr>
           <w:rFonts w:ascii="Times New Roman" w:eastAsiaTheme="minorEastAsia" w:hAnsi="Times New Roman" w:cs="Times New Roman"/>
@@ -6241,10 +6344,10 @@
           <w:noProof/>
         </w:rPr>
         <w:drawing>
-          <wp:inline distT="0" distB="0" distL="0" distR="0" wp14:anchorId="5F6390B0" wp14:editId="09B2958B">
-            <wp:extent cx="5940425" cy="3186430"/>
-            <wp:effectExtent l="0" t="0" r="3175" b="1270"/>
-            <wp:docPr id="4" name="Рисунок 4"/>
+          <wp:inline distT="0" distB="0" distL="0" distR="0">
+            <wp:extent cx="5940425" cy="4264660"/>
+            <wp:effectExtent l="0" t="0" r="3175" b="2540"/>
+            <wp:docPr id="1" name="Рисунок 1"/>
             <wp:cNvGraphicFramePr>
               <a:graphicFrameLocks xmlns:a="http://schemas.openxmlformats.org/drawingml/2006/main" noChangeAspect="1"/>
             </wp:cNvGraphicFramePr>
@@ -6252,11 +6355,11 @@
               <a:graphicData uri="http://schemas.openxmlformats.org/drawingml/2006/picture">
                 <pic:pic xmlns:pic="http://schemas.openxmlformats.org/drawingml/2006/picture">
                   <pic:nvPicPr>
-                    <pic:cNvPr id="4" name="Рисунок 4"/>
+                    <pic:cNvPr id="1" name="Рисунок 1"/>
                     <pic:cNvPicPr/>
                   </pic:nvPicPr>
                   <pic:blipFill>
-                    <a:blip r:embed="rId9">
+                    <a:blip r:embed="rId9" cstate="print">
                       <a:extLst>
                         <a:ext uri="{28A0092B-C50C-407E-A947-70E740481C1C}">
                           <a14:useLocalDpi xmlns:a14="http://schemas.microsoft.com/office/drawing/2010/main" val="0"/>
@@ -6270,7 +6373,7 @@
                   <pic:spPr>
                     <a:xfrm>
                       <a:off x="0" y="0"/>
-                      <a:ext cx="5940425" cy="3186430"/>
+                      <a:ext cx="5940425" cy="4264660"/>
                     </a:xfrm>
                     <a:prstGeom prst="rect">
                       <a:avLst/>
@@ -6282,6 +6385,14 @@
           </wp:inline>
         </w:drawing>
       </w:r>
+    </w:p>
+    <w:p>
+      <w:pPr>
+        <w:rPr>
+          <w:rFonts w:ascii="Times New Roman" w:eastAsiaTheme="minorEastAsia" w:hAnsi="Times New Roman" w:cs="Times New Roman"/>
+          <w:iCs/>
+        </w:rPr>
+      </w:pPr>
     </w:p>
     <w:p>
       <w:pPr>
@@ -6986,7 +7097,6 @@
                 <w:rFonts w:ascii="Times New Roman" w:eastAsiaTheme="minorEastAsia" w:hAnsi="Times New Roman" w:cs="Times New Roman"/>
                 <w:iCs/>
               </w:rPr>
-              <w:lastRenderedPageBreak/>
               <w:t>Квадруполи</w:t>
             </w:r>
           </w:p>
@@ -7772,19 +7882,11 @@
         </w:rPr>
         <w:t xml:space="preserve"> </w:t>
       </w:r>
-      <w:proofErr w:type="spellStart"/>
-      <w:r>
-        <w:rPr>
-          <w:rFonts w:ascii="Times New Roman" w:eastAsiaTheme="minorEastAsia" w:hAnsi="Times New Roman" w:cs="Times New Roman"/>
-        </w:rPr>
-        <w:t>суперпериодичности</w:t>
-      </w:r>
-      <w:proofErr w:type="spellEnd"/>
-      <w:r>
-        <w:rPr>
-          <w:rFonts w:ascii="Times New Roman" w:eastAsiaTheme="minorEastAsia" w:hAnsi="Times New Roman" w:cs="Times New Roman"/>
-        </w:rPr>
-        <w:t xml:space="preserve"> арки </w:t>
+      <w:r>
+        <w:rPr>
+          <w:rFonts w:ascii="Times New Roman" w:eastAsiaTheme="minorEastAsia" w:hAnsi="Times New Roman" w:cs="Times New Roman"/>
+        </w:rPr>
+        <w:t xml:space="preserve">суперпериодичности арки </w:t>
       </w:r>
       <m:oMath>
         <m:r>

</xml_diff>